<commit_message>
Enhance mobile navbar responsiveness and styling adjustments
</commit_message>
<xml_diff>
--- a/Rajesh_Karki_CET138_Assignment.docx
+++ b/Rajesh_Karki_CET138_Assignment.docx
@@ -49,21 +49,14 @@
           <w:rPr>
             <w:rStyle w:val="Hyperlink"/>
           </w:rPr>
-          <w:t>https://rajeshkarki00</w:t>
-        </w:r>
-        <w:r>
-          <w:rPr>
-            <w:rStyle w:val="Hyperlink"/>
-          </w:rPr>
-          <w:t>7</w:t>
-        </w:r>
-        <w:r>
-          <w:rPr>
-            <w:rStyle w:val="Hyperlink"/>
-          </w:rPr>
-          <w:t>.github.io/Eportfolio/</w:t>
+          <w:t>https://rajeshkarki007.github.io/Eportfolio/</w:t>
         </w:r>
       </w:hyperlink>
+    </w:p>
+    <w:p>
+      <w:r>
+        <w:br w:type="page"/>
+      </w:r>
     </w:p>
     <w:p/>
     <w:p>
@@ -947,19 +940,7 @@
           <w:rPr>
             <w:rStyle w:val="Hyperlink"/>
           </w:rPr>
-          <w:t>https://karkirajesh.</w:t>
-        </w:r>
-        <w:r>
-          <w:rPr>
-            <w:rStyle w:val="Hyperlink"/>
-          </w:rPr>
-          <w:t>c</w:t>
-        </w:r>
-        <w:r>
-          <w:rPr>
-            <w:rStyle w:val="Hyperlink"/>
-          </w:rPr>
-          <w:t>om.np/</w:t>
+          <w:t>https://karkirajesh.com.np/</w:t>
         </w:r>
       </w:hyperlink>
     </w:p>

</xml_diff>

<commit_message>
Update navbar styles for improved mobile responsiveness and usability
</commit_message>
<xml_diff>
--- a/Rajesh_Karki_CET138_Assignment.docx
+++ b/Rajesh_Karki_CET138_Assignment.docx
@@ -44,7 +44,7 @@
       <w:r>
         <w:t xml:space="preserve">Live Demo link : </w:t>
       </w:r>
-      <w:hyperlink r:id="rId5" w:history="1">
+      <w:hyperlink r:id="rId6" w:history="1">
         <w:r>
           <w:rPr>
             <w:rStyle w:val="Hyperlink"/>
@@ -58,6 +58,3727 @@
         <w:br w:type="page"/>
       </w:r>
     </w:p>
+    <w:sdt>
+      <w:sdtPr>
+        <w:id w:val="-2118356310"/>
+        <w:docPartObj>
+          <w:docPartGallery w:val="Table of Contents"/>
+          <w:docPartUnique/>
+        </w:docPartObj>
+      </w:sdtPr>
+      <w:sdtEndPr>
+        <w:rPr>
+          <w:rFonts w:ascii="Times New Roman" w:eastAsia="Times New Roman" w:hAnsi="Times New Roman" w:cs="Times New Roman"/>
+          <w:b/>
+          <w:bCs/>
+          <w:noProof/>
+          <w:color w:val="auto"/>
+          <w:sz w:val="24"/>
+          <w:szCs w:val="24"/>
+        </w:rPr>
+      </w:sdtEndPr>
+      <w:sdtContent>
+        <w:p>
+          <w:pPr>
+            <w:pStyle w:val="TOCHeading"/>
+            <w:rPr>
+              <w:rFonts w:ascii="Times New Roman" w:hAnsi="Times New Roman" w:cs="Times New Roman"/>
+              <w:b/>
+              <w:bCs/>
+              <w:color w:val="auto"/>
+            </w:rPr>
+          </w:pPr>
+          <w:r>
+            <w:rPr>
+              <w:rFonts w:ascii="Times New Roman" w:hAnsi="Times New Roman" w:cs="Times New Roman"/>
+              <w:b/>
+              <w:bCs/>
+              <w:color w:val="auto"/>
+            </w:rPr>
+            <w:t>Table of Contents</w:t>
+          </w:r>
+        </w:p>
+        <w:p>
+          <w:pPr>
+            <w:pStyle w:val="TOC1"/>
+            <w:tabs>
+              <w:tab w:val="right" w:leader="dot" w:pos="9350"/>
+            </w:tabs>
+            <w:rPr>
+              <w:b/>
+              <w:bCs/>
+              <w:noProof/>
+              <w:sz w:val="28"/>
+              <w:szCs w:val="28"/>
+            </w:rPr>
+          </w:pPr>
+          <w:r>
+            <w:rPr>
+              <w:b/>
+              <w:bCs/>
+              <w:sz w:val="28"/>
+              <w:szCs w:val="28"/>
+            </w:rPr>
+            <w:fldChar w:fldCharType="begin"/>
+          </w:r>
+          <w:r>
+            <w:rPr>
+              <w:b/>
+              <w:bCs/>
+              <w:sz w:val="28"/>
+              <w:szCs w:val="28"/>
+            </w:rPr>
+            <w:instrText xml:space="preserve"> TOC \o "1-3" \h \z \u </w:instrText>
+          </w:r>
+          <w:r>
+            <w:rPr>
+              <w:b/>
+              <w:bCs/>
+              <w:sz w:val="28"/>
+              <w:szCs w:val="28"/>
+            </w:rPr>
+            <w:fldChar w:fldCharType="separate"/>
+          </w:r>
+          <w:hyperlink w:anchor="_Toc224819589" w:history="1">
+            <w:r>
+              <w:rPr>
+                <w:rStyle w:val="Hyperlink"/>
+                <w:b/>
+                <w:bCs/>
+                <w:noProof/>
+                <w:sz w:val="28"/>
+                <w:szCs w:val="28"/>
+              </w:rPr>
+              <w:t>1. Introduction</w:t>
+            </w:r>
+            <w:r>
+              <w:rPr>
+                <w:b/>
+                <w:bCs/>
+                <w:noProof/>
+                <w:webHidden/>
+                <w:sz w:val="28"/>
+                <w:szCs w:val="28"/>
+              </w:rPr>
+              <w:tab/>
+            </w:r>
+            <w:r>
+              <w:rPr>
+                <w:b/>
+                <w:bCs/>
+                <w:noProof/>
+                <w:webHidden/>
+                <w:sz w:val="28"/>
+                <w:szCs w:val="28"/>
+              </w:rPr>
+              <w:fldChar w:fldCharType="begin"/>
+            </w:r>
+            <w:r>
+              <w:rPr>
+                <w:b/>
+                <w:bCs/>
+                <w:noProof/>
+                <w:webHidden/>
+                <w:sz w:val="28"/>
+                <w:szCs w:val="28"/>
+              </w:rPr>
+              <w:instrText xml:space="preserve"> PAGEREF _Toc224819589 \h </w:instrText>
+            </w:r>
+            <w:r>
+              <w:rPr>
+                <w:b/>
+                <w:bCs/>
+                <w:noProof/>
+                <w:webHidden/>
+                <w:sz w:val="28"/>
+                <w:szCs w:val="28"/>
+              </w:rPr>
+            </w:r>
+            <w:r>
+              <w:rPr>
+                <w:b/>
+                <w:bCs/>
+                <w:noProof/>
+                <w:webHidden/>
+                <w:sz w:val="28"/>
+                <w:szCs w:val="28"/>
+              </w:rPr>
+              <w:fldChar w:fldCharType="separate"/>
+            </w:r>
+            <w:r>
+              <w:rPr>
+                <w:b/>
+                <w:bCs/>
+                <w:noProof/>
+                <w:webHidden/>
+                <w:sz w:val="28"/>
+                <w:szCs w:val="28"/>
+              </w:rPr>
+              <w:t>3</w:t>
+            </w:r>
+            <w:r>
+              <w:rPr>
+                <w:b/>
+                <w:bCs/>
+                <w:noProof/>
+                <w:webHidden/>
+                <w:sz w:val="28"/>
+                <w:szCs w:val="28"/>
+              </w:rPr>
+              <w:fldChar w:fldCharType="end"/>
+            </w:r>
+          </w:hyperlink>
+        </w:p>
+        <w:p>
+          <w:pPr>
+            <w:pStyle w:val="TOC1"/>
+            <w:tabs>
+              <w:tab w:val="right" w:leader="dot" w:pos="9350"/>
+            </w:tabs>
+            <w:rPr>
+              <w:b/>
+              <w:bCs/>
+              <w:noProof/>
+              <w:sz w:val="28"/>
+              <w:szCs w:val="28"/>
+            </w:rPr>
+          </w:pPr>
+          <w:hyperlink w:anchor="_Toc224819590" w:history="1">
+            <w:r>
+              <w:rPr>
+                <w:rStyle w:val="Hyperlink"/>
+                <w:b/>
+                <w:bCs/>
+                <w:noProof/>
+                <w:sz w:val="28"/>
+                <w:szCs w:val="28"/>
+              </w:rPr>
+              <w:t>2. Full Stack Development</w:t>
+            </w:r>
+            <w:r>
+              <w:rPr>
+                <w:b/>
+                <w:bCs/>
+                <w:noProof/>
+                <w:webHidden/>
+                <w:sz w:val="28"/>
+                <w:szCs w:val="28"/>
+              </w:rPr>
+              <w:tab/>
+            </w:r>
+            <w:r>
+              <w:rPr>
+                <w:b/>
+                <w:bCs/>
+                <w:noProof/>
+                <w:webHidden/>
+                <w:sz w:val="28"/>
+                <w:szCs w:val="28"/>
+              </w:rPr>
+              <w:fldChar w:fldCharType="begin"/>
+            </w:r>
+            <w:r>
+              <w:rPr>
+                <w:b/>
+                <w:bCs/>
+                <w:noProof/>
+                <w:webHidden/>
+                <w:sz w:val="28"/>
+                <w:szCs w:val="28"/>
+              </w:rPr>
+              <w:instrText xml:space="preserve"> PAGEREF _Toc224819590 \h </w:instrText>
+            </w:r>
+            <w:r>
+              <w:rPr>
+                <w:b/>
+                <w:bCs/>
+                <w:noProof/>
+                <w:webHidden/>
+                <w:sz w:val="28"/>
+                <w:szCs w:val="28"/>
+              </w:rPr>
+            </w:r>
+            <w:r>
+              <w:rPr>
+                <w:b/>
+                <w:bCs/>
+                <w:noProof/>
+                <w:webHidden/>
+                <w:sz w:val="28"/>
+                <w:szCs w:val="28"/>
+              </w:rPr>
+              <w:fldChar w:fldCharType="separate"/>
+            </w:r>
+            <w:r>
+              <w:rPr>
+                <w:b/>
+                <w:bCs/>
+                <w:noProof/>
+                <w:webHidden/>
+                <w:sz w:val="28"/>
+                <w:szCs w:val="28"/>
+              </w:rPr>
+              <w:t>3</w:t>
+            </w:r>
+            <w:r>
+              <w:rPr>
+                <w:b/>
+                <w:bCs/>
+                <w:noProof/>
+                <w:webHidden/>
+                <w:sz w:val="28"/>
+                <w:szCs w:val="28"/>
+              </w:rPr>
+              <w:fldChar w:fldCharType="end"/>
+            </w:r>
+          </w:hyperlink>
+        </w:p>
+        <w:p>
+          <w:pPr>
+            <w:pStyle w:val="TOC2"/>
+            <w:tabs>
+              <w:tab w:val="right" w:leader="dot" w:pos="9350"/>
+            </w:tabs>
+            <w:rPr>
+              <w:b/>
+              <w:bCs/>
+              <w:noProof/>
+              <w:sz w:val="28"/>
+              <w:szCs w:val="28"/>
+            </w:rPr>
+          </w:pPr>
+          <w:hyperlink w:anchor="_Toc224819591" w:history="1">
+            <w:r>
+              <w:rPr>
+                <w:rStyle w:val="Hyperlink"/>
+                <w:b/>
+                <w:bCs/>
+                <w:noProof/>
+                <w:sz w:val="28"/>
+                <w:szCs w:val="28"/>
+              </w:rPr>
+              <w:t>2.1 Frontend</w:t>
+            </w:r>
+            <w:r>
+              <w:rPr>
+                <w:b/>
+                <w:bCs/>
+                <w:noProof/>
+                <w:webHidden/>
+                <w:sz w:val="28"/>
+                <w:szCs w:val="28"/>
+              </w:rPr>
+              <w:tab/>
+            </w:r>
+            <w:r>
+              <w:rPr>
+                <w:b/>
+                <w:bCs/>
+                <w:noProof/>
+                <w:webHidden/>
+                <w:sz w:val="28"/>
+                <w:szCs w:val="28"/>
+              </w:rPr>
+              <w:fldChar w:fldCharType="begin"/>
+            </w:r>
+            <w:r>
+              <w:rPr>
+                <w:b/>
+                <w:bCs/>
+                <w:noProof/>
+                <w:webHidden/>
+                <w:sz w:val="28"/>
+                <w:szCs w:val="28"/>
+              </w:rPr>
+              <w:instrText xml:space="preserve"> PAGEREF _Toc224819591 \h </w:instrText>
+            </w:r>
+            <w:r>
+              <w:rPr>
+                <w:b/>
+                <w:bCs/>
+                <w:noProof/>
+                <w:webHidden/>
+                <w:sz w:val="28"/>
+                <w:szCs w:val="28"/>
+              </w:rPr>
+            </w:r>
+            <w:r>
+              <w:rPr>
+                <w:b/>
+                <w:bCs/>
+                <w:noProof/>
+                <w:webHidden/>
+                <w:sz w:val="28"/>
+                <w:szCs w:val="28"/>
+              </w:rPr>
+              <w:fldChar w:fldCharType="separate"/>
+            </w:r>
+            <w:r>
+              <w:rPr>
+                <w:b/>
+                <w:bCs/>
+                <w:noProof/>
+                <w:webHidden/>
+                <w:sz w:val="28"/>
+                <w:szCs w:val="28"/>
+              </w:rPr>
+              <w:t>3</w:t>
+            </w:r>
+            <w:r>
+              <w:rPr>
+                <w:b/>
+                <w:bCs/>
+                <w:noProof/>
+                <w:webHidden/>
+                <w:sz w:val="28"/>
+                <w:szCs w:val="28"/>
+              </w:rPr>
+              <w:fldChar w:fldCharType="end"/>
+            </w:r>
+          </w:hyperlink>
+        </w:p>
+        <w:p>
+          <w:pPr>
+            <w:pStyle w:val="TOC2"/>
+            <w:tabs>
+              <w:tab w:val="right" w:leader="dot" w:pos="9350"/>
+            </w:tabs>
+            <w:rPr>
+              <w:b/>
+              <w:bCs/>
+              <w:noProof/>
+              <w:sz w:val="28"/>
+              <w:szCs w:val="28"/>
+            </w:rPr>
+          </w:pPr>
+          <w:hyperlink w:anchor="_Toc224819592" w:history="1">
+            <w:r>
+              <w:rPr>
+                <w:rStyle w:val="Hyperlink"/>
+                <w:b/>
+                <w:bCs/>
+                <w:noProof/>
+                <w:sz w:val="28"/>
+                <w:szCs w:val="28"/>
+              </w:rPr>
+              <w:t>2.2 Backend</w:t>
+            </w:r>
+            <w:r>
+              <w:rPr>
+                <w:b/>
+                <w:bCs/>
+                <w:noProof/>
+                <w:webHidden/>
+                <w:sz w:val="28"/>
+                <w:szCs w:val="28"/>
+              </w:rPr>
+              <w:tab/>
+            </w:r>
+            <w:r>
+              <w:rPr>
+                <w:b/>
+                <w:bCs/>
+                <w:noProof/>
+                <w:webHidden/>
+                <w:sz w:val="28"/>
+                <w:szCs w:val="28"/>
+              </w:rPr>
+              <w:fldChar w:fldCharType="begin"/>
+            </w:r>
+            <w:r>
+              <w:rPr>
+                <w:b/>
+                <w:bCs/>
+                <w:noProof/>
+                <w:webHidden/>
+                <w:sz w:val="28"/>
+                <w:szCs w:val="28"/>
+              </w:rPr>
+              <w:instrText xml:space="preserve"> PAGEREF _Toc224819592 \h </w:instrText>
+            </w:r>
+            <w:r>
+              <w:rPr>
+                <w:b/>
+                <w:bCs/>
+                <w:noProof/>
+                <w:webHidden/>
+                <w:sz w:val="28"/>
+                <w:szCs w:val="28"/>
+              </w:rPr>
+            </w:r>
+            <w:r>
+              <w:rPr>
+                <w:b/>
+                <w:bCs/>
+                <w:noProof/>
+                <w:webHidden/>
+                <w:sz w:val="28"/>
+                <w:szCs w:val="28"/>
+              </w:rPr>
+              <w:fldChar w:fldCharType="separate"/>
+            </w:r>
+            <w:r>
+              <w:rPr>
+                <w:b/>
+                <w:bCs/>
+                <w:noProof/>
+                <w:webHidden/>
+                <w:sz w:val="28"/>
+                <w:szCs w:val="28"/>
+              </w:rPr>
+              <w:t>3</w:t>
+            </w:r>
+            <w:r>
+              <w:rPr>
+                <w:b/>
+                <w:bCs/>
+                <w:noProof/>
+                <w:webHidden/>
+                <w:sz w:val="28"/>
+                <w:szCs w:val="28"/>
+              </w:rPr>
+              <w:fldChar w:fldCharType="end"/>
+            </w:r>
+          </w:hyperlink>
+        </w:p>
+        <w:p>
+          <w:pPr>
+            <w:pStyle w:val="TOC2"/>
+            <w:tabs>
+              <w:tab w:val="right" w:leader="dot" w:pos="9350"/>
+            </w:tabs>
+            <w:rPr>
+              <w:b/>
+              <w:bCs/>
+              <w:noProof/>
+              <w:sz w:val="28"/>
+              <w:szCs w:val="28"/>
+            </w:rPr>
+          </w:pPr>
+          <w:hyperlink w:anchor="_Toc224819593" w:history="1">
+            <w:r>
+              <w:rPr>
+                <w:rStyle w:val="Hyperlink"/>
+                <w:b/>
+                <w:bCs/>
+                <w:noProof/>
+                <w:sz w:val="28"/>
+                <w:szCs w:val="28"/>
+              </w:rPr>
+              <w:t>2.3 Why Full Stack?</w:t>
+            </w:r>
+            <w:r>
+              <w:rPr>
+                <w:b/>
+                <w:bCs/>
+                <w:noProof/>
+                <w:webHidden/>
+                <w:sz w:val="28"/>
+                <w:szCs w:val="28"/>
+              </w:rPr>
+              <w:tab/>
+            </w:r>
+            <w:r>
+              <w:rPr>
+                <w:b/>
+                <w:bCs/>
+                <w:noProof/>
+                <w:webHidden/>
+                <w:sz w:val="28"/>
+                <w:szCs w:val="28"/>
+              </w:rPr>
+              <w:fldChar w:fldCharType="begin"/>
+            </w:r>
+            <w:r>
+              <w:rPr>
+                <w:b/>
+                <w:bCs/>
+                <w:noProof/>
+                <w:webHidden/>
+                <w:sz w:val="28"/>
+                <w:szCs w:val="28"/>
+              </w:rPr>
+              <w:instrText xml:space="preserve"> PAGEREF _Toc224819593 \h </w:instrText>
+            </w:r>
+            <w:r>
+              <w:rPr>
+                <w:b/>
+                <w:bCs/>
+                <w:noProof/>
+                <w:webHidden/>
+                <w:sz w:val="28"/>
+                <w:szCs w:val="28"/>
+              </w:rPr>
+            </w:r>
+            <w:r>
+              <w:rPr>
+                <w:b/>
+                <w:bCs/>
+                <w:noProof/>
+                <w:webHidden/>
+                <w:sz w:val="28"/>
+                <w:szCs w:val="28"/>
+              </w:rPr>
+              <w:fldChar w:fldCharType="separate"/>
+            </w:r>
+            <w:r>
+              <w:rPr>
+                <w:b/>
+                <w:bCs/>
+                <w:noProof/>
+                <w:webHidden/>
+                <w:sz w:val="28"/>
+                <w:szCs w:val="28"/>
+              </w:rPr>
+              <w:t>4</w:t>
+            </w:r>
+            <w:r>
+              <w:rPr>
+                <w:b/>
+                <w:bCs/>
+                <w:noProof/>
+                <w:webHidden/>
+                <w:sz w:val="28"/>
+                <w:szCs w:val="28"/>
+              </w:rPr>
+              <w:fldChar w:fldCharType="end"/>
+            </w:r>
+          </w:hyperlink>
+        </w:p>
+        <w:p>
+          <w:pPr>
+            <w:pStyle w:val="TOC1"/>
+            <w:tabs>
+              <w:tab w:val="right" w:leader="dot" w:pos="9350"/>
+            </w:tabs>
+            <w:rPr>
+              <w:b/>
+              <w:bCs/>
+              <w:noProof/>
+              <w:sz w:val="28"/>
+              <w:szCs w:val="28"/>
+            </w:rPr>
+          </w:pPr>
+          <w:hyperlink w:anchor="_Toc224819594" w:history="1">
+            <w:r>
+              <w:rPr>
+                <w:rStyle w:val="Hyperlink"/>
+                <w:b/>
+                <w:bCs/>
+                <w:noProof/>
+                <w:sz w:val="28"/>
+                <w:szCs w:val="28"/>
+              </w:rPr>
+              <w:t>3. HTML</w:t>
+            </w:r>
+            <w:r>
+              <w:rPr>
+                <w:b/>
+                <w:bCs/>
+                <w:noProof/>
+                <w:webHidden/>
+                <w:sz w:val="28"/>
+                <w:szCs w:val="28"/>
+              </w:rPr>
+              <w:tab/>
+            </w:r>
+            <w:r>
+              <w:rPr>
+                <w:b/>
+                <w:bCs/>
+                <w:noProof/>
+                <w:webHidden/>
+                <w:sz w:val="28"/>
+                <w:szCs w:val="28"/>
+              </w:rPr>
+              <w:fldChar w:fldCharType="begin"/>
+            </w:r>
+            <w:r>
+              <w:rPr>
+                <w:b/>
+                <w:bCs/>
+                <w:noProof/>
+                <w:webHidden/>
+                <w:sz w:val="28"/>
+                <w:szCs w:val="28"/>
+              </w:rPr>
+              <w:instrText xml:space="preserve"> PAGEREF _Toc224819594 \h </w:instrText>
+            </w:r>
+            <w:r>
+              <w:rPr>
+                <w:b/>
+                <w:bCs/>
+                <w:noProof/>
+                <w:webHidden/>
+                <w:sz w:val="28"/>
+                <w:szCs w:val="28"/>
+              </w:rPr>
+            </w:r>
+            <w:r>
+              <w:rPr>
+                <w:b/>
+                <w:bCs/>
+                <w:noProof/>
+                <w:webHidden/>
+                <w:sz w:val="28"/>
+                <w:szCs w:val="28"/>
+              </w:rPr>
+              <w:fldChar w:fldCharType="separate"/>
+            </w:r>
+            <w:r>
+              <w:rPr>
+                <w:b/>
+                <w:bCs/>
+                <w:noProof/>
+                <w:webHidden/>
+                <w:sz w:val="28"/>
+                <w:szCs w:val="28"/>
+              </w:rPr>
+              <w:t>5</w:t>
+            </w:r>
+            <w:r>
+              <w:rPr>
+                <w:b/>
+                <w:bCs/>
+                <w:noProof/>
+                <w:webHidden/>
+                <w:sz w:val="28"/>
+                <w:szCs w:val="28"/>
+              </w:rPr>
+              <w:fldChar w:fldCharType="end"/>
+            </w:r>
+          </w:hyperlink>
+        </w:p>
+        <w:p>
+          <w:pPr>
+            <w:pStyle w:val="TOC2"/>
+            <w:tabs>
+              <w:tab w:val="right" w:leader="dot" w:pos="9350"/>
+            </w:tabs>
+            <w:rPr>
+              <w:b/>
+              <w:bCs/>
+              <w:noProof/>
+              <w:sz w:val="28"/>
+              <w:szCs w:val="28"/>
+            </w:rPr>
+          </w:pPr>
+          <w:hyperlink w:anchor="_Toc224819595" w:history="1">
+            <w:r>
+              <w:rPr>
+                <w:rStyle w:val="Hyperlink"/>
+                <w:b/>
+                <w:bCs/>
+                <w:noProof/>
+                <w:sz w:val="28"/>
+                <w:szCs w:val="28"/>
+              </w:rPr>
+              <w:t>3.1 Semantic Elements</w:t>
+            </w:r>
+            <w:r>
+              <w:rPr>
+                <w:b/>
+                <w:bCs/>
+                <w:noProof/>
+                <w:webHidden/>
+                <w:sz w:val="28"/>
+                <w:szCs w:val="28"/>
+              </w:rPr>
+              <w:tab/>
+            </w:r>
+            <w:r>
+              <w:rPr>
+                <w:b/>
+                <w:bCs/>
+                <w:noProof/>
+                <w:webHidden/>
+                <w:sz w:val="28"/>
+                <w:szCs w:val="28"/>
+              </w:rPr>
+              <w:fldChar w:fldCharType="begin"/>
+            </w:r>
+            <w:r>
+              <w:rPr>
+                <w:b/>
+                <w:bCs/>
+                <w:noProof/>
+                <w:webHidden/>
+                <w:sz w:val="28"/>
+                <w:szCs w:val="28"/>
+              </w:rPr>
+              <w:instrText xml:space="preserve"> PAGEREF _Toc224819595 \h </w:instrText>
+            </w:r>
+            <w:r>
+              <w:rPr>
+                <w:b/>
+                <w:bCs/>
+                <w:noProof/>
+                <w:webHidden/>
+                <w:sz w:val="28"/>
+                <w:szCs w:val="28"/>
+              </w:rPr>
+            </w:r>
+            <w:r>
+              <w:rPr>
+                <w:b/>
+                <w:bCs/>
+                <w:noProof/>
+                <w:webHidden/>
+                <w:sz w:val="28"/>
+                <w:szCs w:val="28"/>
+              </w:rPr>
+              <w:fldChar w:fldCharType="separate"/>
+            </w:r>
+            <w:r>
+              <w:rPr>
+                <w:b/>
+                <w:bCs/>
+                <w:noProof/>
+                <w:webHidden/>
+                <w:sz w:val="28"/>
+                <w:szCs w:val="28"/>
+              </w:rPr>
+              <w:t>5</w:t>
+            </w:r>
+            <w:r>
+              <w:rPr>
+                <w:b/>
+                <w:bCs/>
+                <w:noProof/>
+                <w:webHidden/>
+                <w:sz w:val="28"/>
+                <w:szCs w:val="28"/>
+              </w:rPr>
+              <w:fldChar w:fldCharType="end"/>
+            </w:r>
+          </w:hyperlink>
+        </w:p>
+        <w:p>
+          <w:pPr>
+            <w:pStyle w:val="TOC2"/>
+            <w:tabs>
+              <w:tab w:val="right" w:leader="dot" w:pos="9350"/>
+            </w:tabs>
+            <w:rPr>
+              <w:b/>
+              <w:bCs/>
+              <w:noProof/>
+              <w:sz w:val="28"/>
+              <w:szCs w:val="28"/>
+            </w:rPr>
+          </w:pPr>
+          <w:hyperlink w:anchor="_Toc224819596" w:history="1">
+            <w:r>
+              <w:rPr>
+                <w:rStyle w:val="Hyperlink"/>
+                <w:b/>
+                <w:bCs/>
+                <w:noProof/>
+                <w:sz w:val="28"/>
+                <w:szCs w:val="28"/>
+              </w:rPr>
+              <w:t>3.2 Forms and Inputs</w:t>
+            </w:r>
+            <w:r>
+              <w:rPr>
+                <w:b/>
+                <w:bCs/>
+                <w:noProof/>
+                <w:webHidden/>
+                <w:sz w:val="28"/>
+                <w:szCs w:val="28"/>
+              </w:rPr>
+              <w:tab/>
+            </w:r>
+            <w:r>
+              <w:rPr>
+                <w:b/>
+                <w:bCs/>
+                <w:noProof/>
+                <w:webHidden/>
+                <w:sz w:val="28"/>
+                <w:szCs w:val="28"/>
+              </w:rPr>
+              <w:fldChar w:fldCharType="begin"/>
+            </w:r>
+            <w:r>
+              <w:rPr>
+                <w:b/>
+                <w:bCs/>
+                <w:noProof/>
+                <w:webHidden/>
+                <w:sz w:val="28"/>
+                <w:szCs w:val="28"/>
+              </w:rPr>
+              <w:instrText xml:space="preserve"> PAGEREF _Toc224819596 \h </w:instrText>
+            </w:r>
+            <w:r>
+              <w:rPr>
+                <w:b/>
+                <w:bCs/>
+                <w:noProof/>
+                <w:webHidden/>
+                <w:sz w:val="28"/>
+                <w:szCs w:val="28"/>
+              </w:rPr>
+            </w:r>
+            <w:r>
+              <w:rPr>
+                <w:b/>
+                <w:bCs/>
+                <w:noProof/>
+                <w:webHidden/>
+                <w:sz w:val="28"/>
+                <w:szCs w:val="28"/>
+              </w:rPr>
+              <w:fldChar w:fldCharType="separate"/>
+            </w:r>
+            <w:r>
+              <w:rPr>
+                <w:b/>
+                <w:bCs/>
+                <w:noProof/>
+                <w:webHidden/>
+                <w:sz w:val="28"/>
+                <w:szCs w:val="28"/>
+              </w:rPr>
+              <w:t>5</w:t>
+            </w:r>
+            <w:r>
+              <w:rPr>
+                <w:b/>
+                <w:bCs/>
+                <w:noProof/>
+                <w:webHidden/>
+                <w:sz w:val="28"/>
+                <w:szCs w:val="28"/>
+              </w:rPr>
+              <w:fldChar w:fldCharType="end"/>
+            </w:r>
+          </w:hyperlink>
+        </w:p>
+        <w:p>
+          <w:pPr>
+            <w:pStyle w:val="TOC2"/>
+            <w:tabs>
+              <w:tab w:val="right" w:leader="dot" w:pos="9350"/>
+            </w:tabs>
+            <w:rPr>
+              <w:b/>
+              <w:bCs/>
+              <w:noProof/>
+              <w:sz w:val="28"/>
+              <w:szCs w:val="28"/>
+            </w:rPr>
+          </w:pPr>
+          <w:hyperlink w:anchor="_Toc224819597" w:history="1">
+            <w:r>
+              <w:rPr>
+                <w:rStyle w:val="Hyperlink"/>
+                <w:b/>
+                <w:bCs/>
+                <w:noProof/>
+                <w:sz w:val="28"/>
+                <w:szCs w:val="28"/>
+              </w:rPr>
+              <w:t>3.3 Tables</w:t>
+            </w:r>
+            <w:r>
+              <w:rPr>
+                <w:b/>
+                <w:bCs/>
+                <w:noProof/>
+                <w:webHidden/>
+                <w:sz w:val="28"/>
+                <w:szCs w:val="28"/>
+              </w:rPr>
+              <w:tab/>
+            </w:r>
+            <w:r>
+              <w:rPr>
+                <w:b/>
+                <w:bCs/>
+                <w:noProof/>
+                <w:webHidden/>
+                <w:sz w:val="28"/>
+                <w:szCs w:val="28"/>
+              </w:rPr>
+              <w:fldChar w:fldCharType="begin"/>
+            </w:r>
+            <w:r>
+              <w:rPr>
+                <w:b/>
+                <w:bCs/>
+                <w:noProof/>
+                <w:webHidden/>
+                <w:sz w:val="28"/>
+                <w:szCs w:val="28"/>
+              </w:rPr>
+              <w:instrText xml:space="preserve"> PAGEREF _Toc224819597 \h </w:instrText>
+            </w:r>
+            <w:r>
+              <w:rPr>
+                <w:b/>
+                <w:bCs/>
+                <w:noProof/>
+                <w:webHidden/>
+                <w:sz w:val="28"/>
+                <w:szCs w:val="28"/>
+              </w:rPr>
+            </w:r>
+            <w:r>
+              <w:rPr>
+                <w:b/>
+                <w:bCs/>
+                <w:noProof/>
+                <w:webHidden/>
+                <w:sz w:val="28"/>
+                <w:szCs w:val="28"/>
+              </w:rPr>
+              <w:fldChar w:fldCharType="separate"/>
+            </w:r>
+            <w:r>
+              <w:rPr>
+                <w:b/>
+                <w:bCs/>
+                <w:noProof/>
+                <w:webHidden/>
+                <w:sz w:val="28"/>
+                <w:szCs w:val="28"/>
+              </w:rPr>
+              <w:t>5</w:t>
+            </w:r>
+            <w:r>
+              <w:rPr>
+                <w:b/>
+                <w:bCs/>
+                <w:noProof/>
+                <w:webHidden/>
+                <w:sz w:val="28"/>
+                <w:szCs w:val="28"/>
+              </w:rPr>
+              <w:fldChar w:fldCharType="end"/>
+            </w:r>
+          </w:hyperlink>
+        </w:p>
+        <w:p>
+          <w:pPr>
+            <w:pStyle w:val="TOC2"/>
+            <w:tabs>
+              <w:tab w:val="right" w:leader="dot" w:pos="9350"/>
+            </w:tabs>
+            <w:rPr>
+              <w:b/>
+              <w:bCs/>
+              <w:noProof/>
+              <w:sz w:val="28"/>
+              <w:szCs w:val="28"/>
+            </w:rPr>
+          </w:pPr>
+          <w:hyperlink w:anchor="_Toc224819598" w:history="1">
+            <w:r>
+              <w:rPr>
+                <w:rStyle w:val="Hyperlink"/>
+                <w:b/>
+                <w:bCs/>
+                <w:noProof/>
+                <w:sz w:val="28"/>
+                <w:szCs w:val="28"/>
+              </w:rPr>
+              <w:t>3.4 Accessibility</w:t>
+            </w:r>
+            <w:r>
+              <w:rPr>
+                <w:b/>
+                <w:bCs/>
+                <w:noProof/>
+                <w:webHidden/>
+                <w:sz w:val="28"/>
+                <w:szCs w:val="28"/>
+              </w:rPr>
+              <w:tab/>
+            </w:r>
+            <w:r>
+              <w:rPr>
+                <w:b/>
+                <w:bCs/>
+                <w:noProof/>
+                <w:webHidden/>
+                <w:sz w:val="28"/>
+                <w:szCs w:val="28"/>
+              </w:rPr>
+              <w:fldChar w:fldCharType="begin"/>
+            </w:r>
+            <w:r>
+              <w:rPr>
+                <w:b/>
+                <w:bCs/>
+                <w:noProof/>
+                <w:webHidden/>
+                <w:sz w:val="28"/>
+                <w:szCs w:val="28"/>
+              </w:rPr>
+              <w:instrText xml:space="preserve"> PAGEREF _Toc224819598 \h </w:instrText>
+            </w:r>
+            <w:r>
+              <w:rPr>
+                <w:b/>
+                <w:bCs/>
+                <w:noProof/>
+                <w:webHidden/>
+                <w:sz w:val="28"/>
+                <w:szCs w:val="28"/>
+              </w:rPr>
+            </w:r>
+            <w:r>
+              <w:rPr>
+                <w:b/>
+                <w:bCs/>
+                <w:noProof/>
+                <w:webHidden/>
+                <w:sz w:val="28"/>
+                <w:szCs w:val="28"/>
+              </w:rPr>
+              <w:fldChar w:fldCharType="separate"/>
+            </w:r>
+            <w:r>
+              <w:rPr>
+                <w:b/>
+                <w:bCs/>
+                <w:noProof/>
+                <w:webHidden/>
+                <w:sz w:val="28"/>
+                <w:szCs w:val="28"/>
+              </w:rPr>
+              <w:t>5</w:t>
+            </w:r>
+            <w:r>
+              <w:rPr>
+                <w:b/>
+                <w:bCs/>
+                <w:noProof/>
+                <w:webHidden/>
+                <w:sz w:val="28"/>
+                <w:szCs w:val="28"/>
+              </w:rPr>
+              <w:fldChar w:fldCharType="end"/>
+            </w:r>
+          </w:hyperlink>
+        </w:p>
+        <w:p>
+          <w:pPr>
+            <w:pStyle w:val="TOC1"/>
+            <w:tabs>
+              <w:tab w:val="right" w:leader="dot" w:pos="9350"/>
+            </w:tabs>
+            <w:rPr>
+              <w:b/>
+              <w:bCs/>
+              <w:noProof/>
+              <w:sz w:val="28"/>
+              <w:szCs w:val="28"/>
+            </w:rPr>
+          </w:pPr>
+          <w:hyperlink w:anchor="_Toc224819599" w:history="1">
+            <w:r>
+              <w:rPr>
+                <w:rStyle w:val="Hyperlink"/>
+                <w:b/>
+                <w:bCs/>
+                <w:noProof/>
+                <w:sz w:val="28"/>
+                <w:szCs w:val="28"/>
+              </w:rPr>
+              <w:t>4. CSS</w:t>
+            </w:r>
+            <w:r>
+              <w:rPr>
+                <w:b/>
+                <w:bCs/>
+                <w:noProof/>
+                <w:webHidden/>
+                <w:sz w:val="28"/>
+                <w:szCs w:val="28"/>
+              </w:rPr>
+              <w:tab/>
+            </w:r>
+            <w:r>
+              <w:rPr>
+                <w:b/>
+                <w:bCs/>
+                <w:noProof/>
+                <w:webHidden/>
+                <w:sz w:val="28"/>
+                <w:szCs w:val="28"/>
+              </w:rPr>
+              <w:fldChar w:fldCharType="begin"/>
+            </w:r>
+            <w:r>
+              <w:rPr>
+                <w:b/>
+                <w:bCs/>
+                <w:noProof/>
+                <w:webHidden/>
+                <w:sz w:val="28"/>
+                <w:szCs w:val="28"/>
+              </w:rPr>
+              <w:instrText xml:space="preserve"> PAGEREF _Toc224819599 \h </w:instrText>
+            </w:r>
+            <w:r>
+              <w:rPr>
+                <w:b/>
+                <w:bCs/>
+                <w:noProof/>
+                <w:webHidden/>
+                <w:sz w:val="28"/>
+                <w:szCs w:val="28"/>
+              </w:rPr>
+            </w:r>
+            <w:r>
+              <w:rPr>
+                <w:b/>
+                <w:bCs/>
+                <w:noProof/>
+                <w:webHidden/>
+                <w:sz w:val="28"/>
+                <w:szCs w:val="28"/>
+              </w:rPr>
+              <w:fldChar w:fldCharType="separate"/>
+            </w:r>
+            <w:r>
+              <w:rPr>
+                <w:b/>
+                <w:bCs/>
+                <w:noProof/>
+                <w:webHidden/>
+                <w:sz w:val="28"/>
+                <w:szCs w:val="28"/>
+              </w:rPr>
+              <w:t>6</w:t>
+            </w:r>
+            <w:r>
+              <w:rPr>
+                <w:b/>
+                <w:bCs/>
+                <w:noProof/>
+                <w:webHidden/>
+                <w:sz w:val="28"/>
+                <w:szCs w:val="28"/>
+              </w:rPr>
+              <w:fldChar w:fldCharType="end"/>
+            </w:r>
+          </w:hyperlink>
+        </w:p>
+        <w:p>
+          <w:pPr>
+            <w:pStyle w:val="TOC2"/>
+            <w:tabs>
+              <w:tab w:val="right" w:leader="dot" w:pos="9350"/>
+            </w:tabs>
+            <w:rPr>
+              <w:b/>
+              <w:bCs/>
+              <w:noProof/>
+              <w:sz w:val="28"/>
+              <w:szCs w:val="28"/>
+            </w:rPr>
+          </w:pPr>
+          <w:hyperlink w:anchor="_Toc224819600" w:history="1">
+            <w:r>
+              <w:rPr>
+                <w:rStyle w:val="Hyperlink"/>
+                <w:b/>
+                <w:bCs/>
+                <w:noProof/>
+                <w:sz w:val="28"/>
+                <w:szCs w:val="28"/>
+              </w:rPr>
+              <w:t>4.1 The Box Model</w:t>
+            </w:r>
+            <w:r>
+              <w:rPr>
+                <w:b/>
+                <w:bCs/>
+                <w:noProof/>
+                <w:webHidden/>
+                <w:sz w:val="28"/>
+                <w:szCs w:val="28"/>
+              </w:rPr>
+              <w:tab/>
+            </w:r>
+            <w:r>
+              <w:rPr>
+                <w:b/>
+                <w:bCs/>
+                <w:noProof/>
+                <w:webHidden/>
+                <w:sz w:val="28"/>
+                <w:szCs w:val="28"/>
+              </w:rPr>
+              <w:fldChar w:fldCharType="begin"/>
+            </w:r>
+            <w:r>
+              <w:rPr>
+                <w:b/>
+                <w:bCs/>
+                <w:noProof/>
+                <w:webHidden/>
+                <w:sz w:val="28"/>
+                <w:szCs w:val="28"/>
+              </w:rPr>
+              <w:instrText xml:space="preserve"> PAGEREF _Toc224819600 \h </w:instrText>
+            </w:r>
+            <w:r>
+              <w:rPr>
+                <w:b/>
+                <w:bCs/>
+                <w:noProof/>
+                <w:webHidden/>
+                <w:sz w:val="28"/>
+                <w:szCs w:val="28"/>
+              </w:rPr>
+            </w:r>
+            <w:r>
+              <w:rPr>
+                <w:b/>
+                <w:bCs/>
+                <w:noProof/>
+                <w:webHidden/>
+                <w:sz w:val="28"/>
+                <w:szCs w:val="28"/>
+              </w:rPr>
+              <w:fldChar w:fldCharType="separate"/>
+            </w:r>
+            <w:r>
+              <w:rPr>
+                <w:b/>
+                <w:bCs/>
+                <w:noProof/>
+                <w:webHidden/>
+                <w:sz w:val="28"/>
+                <w:szCs w:val="28"/>
+              </w:rPr>
+              <w:t>6</w:t>
+            </w:r>
+            <w:r>
+              <w:rPr>
+                <w:b/>
+                <w:bCs/>
+                <w:noProof/>
+                <w:webHidden/>
+                <w:sz w:val="28"/>
+                <w:szCs w:val="28"/>
+              </w:rPr>
+              <w:fldChar w:fldCharType="end"/>
+            </w:r>
+          </w:hyperlink>
+        </w:p>
+        <w:p>
+          <w:pPr>
+            <w:pStyle w:val="TOC2"/>
+            <w:tabs>
+              <w:tab w:val="right" w:leader="dot" w:pos="9350"/>
+            </w:tabs>
+            <w:rPr>
+              <w:b/>
+              <w:bCs/>
+              <w:noProof/>
+              <w:sz w:val="28"/>
+              <w:szCs w:val="28"/>
+            </w:rPr>
+          </w:pPr>
+          <w:hyperlink w:anchor="_Toc224819601" w:history="1">
+            <w:r>
+              <w:rPr>
+                <w:rStyle w:val="Hyperlink"/>
+                <w:b/>
+                <w:bCs/>
+                <w:noProof/>
+                <w:sz w:val="28"/>
+                <w:szCs w:val="28"/>
+              </w:rPr>
+              <w:t>4.2 Flexbox</w:t>
+            </w:r>
+            <w:r>
+              <w:rPr>
+                <w:b/>
+                <w:bCs/>
+                <w:noProof/>
+                <w:webHidden/>
+                <w:sz w:val="28"/>
+                <w:szCs w:val="28"/>
+              </w:rPr>
+              <w:tab/>
+            </w:r>
+            <w:r>
+              <w:rPr>
+                <w:b/>
+                <w:bCs/>
+                <w:noProof/>
+                <w:webHidden/>
+                <w:sz w:val="28"/>
+                <w:szCs w:val="28"/>
+              </w:rPr>
+              <w:fldChar w:fldCharType="begin"/>
+            </w:r>
+            <w:r>
+              <w:rPr>
+                <w:b/>
+                <w:bCs/>
+                <w:noProof/>
+                <w:webHidden/>
+                <w:sz w:val="28"/>
+                <w:szCs w:val="28"/>
+              </w:rPr>
+              <w:instrText xml:space="preserve"> PAGEREF _Toc224819601 \h </w:instrText>
+            </w:r>
+            <w:r>
+              <w:rPr>
+                <w:b/>
+                <w:bCs/>
+                <w:noProof/>
+                <w:webHidden/>
+                <w:sz w:val="28"/>
+                <w:szCs w:val="28"/>
+              </w:rPr>
+            </w:r>
+            <w:r>
+              <w:rPr>
+                <w:b/>
+                <w:bCs/>
+                <w:noProof/>
+                <w:webHidden/>
+                <w:sz w:val="28"/>
+                <w:szCs w:val="28"/>
+              </w:rPr>
+              <w:fldChar w:fldCharType="separate"/>
+            </w:r>
+            <w:r>
+              <w:rPr>
+                <w:b/>
+                <w:bCs/>
+                <w:noProof/>
+                <w:webHidden/>
+                <w:sz w:val="28"/>
+                <w:szCs w:val="28"/>
+              </w:rPr>
+              <w:t>6</w:t>
+            </w:r>
+            <w:r>
+              <w:rPr>
+                <w:b/>
+                <w:bCs/>
+                <w:noProof/>
+                <w:webHidden/>
+                <w:sz w:val="28"/>
+                <w:szCs w:val="28"/>
+              </w:rPr>
+              <w:fldChar w:fldCharType="end"/>
+            </w:r>
+          </w:hyperlink>
+        </w:p>
+        <w:p>
+          <w:pPr>
+            <w:pStyle w:val="TOC2"/>
+            <w:tabs>
+              <w:tab w:val="right" w:leader="dot" w:pos="9350"/>
+            </w:tabs>
+            <w:rPr>
+              <w:b/>
+              <w:bCs/>
+              <w:noProof/>
+              <w:sz w:val="28"/>
+              <w:szCs w:val="28"/>
+            </w:rPr>
+          </w:pPr>
+          <w:hyperlink w:anchor="_Toc224819602" w:history="1">
+            <w:r>
+              <w:rPr>
+                <w:rStyle w:val="Hyperlink"/>
+                <w:b/>
+                <w:bCs/>
+                <w:noProof/>
+                <w:sz w:val="28"/>
+                <w:szCs w:val="28"/>
+              </w:rPr>
+              <w:t>4.3 CSS Grid</w:t>
+            </w:r>
+            <w:r>
+              <w:rPr>
+                <w:b/>
+                <w:bCs/>
+                <w:noProof/>
+                <w:webHidden/>
+                <w:sz w:val="28"/>
+                <w:szCs w:val="28"/>
+              </w:rPr>
+              <w:tab/>
+            </w:r>
+            <w:r>
+              <w:rPr>
+                <w:b/>
+                <w:bCs/>
+                <w:noProof/>
+                <w:webHidden/>
+                <w:sz w:val="28"/>
+                <w:szCs w:val="28"/>
+              </w:rPr>
+              <w:fldChar w:fldCharType="begin"/>
+            </w:r>
+            <w:r>
+              <w:rPr>
+                <w:b/>
+                <w:bCs/>
+                <w:noProof/>
+                <w:webHidden/>
+                <w:sz w:val="28"/>
+                <w:szCs w:val="28"/>
+              </w:rPr>
+              <w:instrText xml:space="preserve"> PAGEREF _Toc224819602 \h </w:instrText>
+            </w:r>
+            <w:r>
+              <w:rPr>
+                <w:b/>
+                <w:bCs/>
+                <w:noProof/>
+                <w:webHidden/>
+                <w:sz w:val="28"/>
+                <w:szCs w:val="28"/>
+              </w:rPr>
+            </w:r>
+            <w:r>
+              <w:rPr>
+                <w:b/>
+                <w:bCs/>
+                <w:noProof/>
+                <w:webHidden/>
+                <w:sz w:val="28"/>
+                <w:szCs w:val="28"/>
+              </w:rPr>
+              <w:fldChar w:fldCharType="separate"/>
+            </w:r>
+            <w:r>
+              <w:rPr>
+                <w:b/>
+                <w:bCs/>
+                <w:noProof/>
+                <w:webHidden/>
+                <w:sz w:val="28"/>
+                <w:szCs w:val="28"/>
+              </w:rPr>
+              <w:t>6</w:t>
+            </w:r>
+            <w:r>
+              <w:rPr>
+                <w:b/>
+                <w:bCs/>
+                <w:noProof/>
+                <w:webHidden/>
+                <w:sz w:val="28"/>
+                <w:szCs w:val="28"/>
+              </w:rPr>
+              <w:fldChar w:fldCharType="end"/>
+            </w:r>
+          </w:hyperlink>
+        </w:p>
+        <w:p>
+          <w:pPr>
+            <w:pStyle w:val="TOC2"/>
+            <w:tabs>
+              <w:tab w:val="right" w:leader="dot" w:pos="9350"/>
+            </w:tabs>
+            <w:rPr>
+              <w:b/>
+              <w:bCs/>
+              <w:noProof/>
+              <w:sz w:val="28"/>
+              <w:szCs w:val="28"/>
+            </w:rPr>
+          </w:pPr>
+          <w:hyperlink w:anchor="_Toc224819603" w:history="1">
+            <w:r>
+              <w:rPr>
+                <w:rStyle w:val="Hyperlink"/>
+                <w:b/>
+                <w:bCs/>
+                <w:noProof/>
+                <w:sz w:val="28"/>
+                <w:szCs w:val="28"/>
+              </w:rPr>
+              <w:t>4.4 Animations and Transitions</w:t>
+            </w:r>
+            <w:r>
+              <w:rPr>
+                <w:b/>
+                <w:bCs/>
+                <w:noProof/>
+                <w:webHidden/>
+                <w:sz w:val="28"/>
+                <w:szCs w:val="28"/>
+              </w:rPr>
+              <w:tab/>
+            </w:r>
+            <w:r>
+              <w:rPr>
+                <w:b/>
+                <w:bCs/>
+                <w:noProof/>
+                <w:webHidden/>
+                <w:sz w:val="28"/>
+                <w:szCs w:val="28"/>
+              </w:rPr>
+              <w:fldChar w:fldCharType="begin"/>
+            </w:r>
+            <w:r>
+              <w:rPr>
+                <w:b/>
+                <w:bCs/>
+                <w:noProof/>
+                <w:webHidden/>
+                <w:sz w:val="28"/>
+                <w:szCs w:val="28"/>
+              </w:rPr>
+              <w:instrText xml:space="preserve"> PAGEREF _Toc224819603 \h </w:instrText>
+            </w:r>
+            <w:r>
+              <w:rPr>
+                <w:b/>
+                <w:bCs/>
+                <w:noProof/>
+                <w:webHidden/>
+                <w:sz w:val="28"/>
+                <w:szCs w:val="28"/>
+              </w:rPr>
+            </w:r>
+            <w:r>
+              <w:rPr>
+                <w:b/>
+                <w:bCs/>
+                <w:noProof/>
+                <w:webHidden/>
+                <w:sz w:val="28"/>
+                <w:szCs w:val="28"/>
+              </w:rPr>
+              <w:fldChar w:fldCharType="separate"/>
+            </w:r>
+            <w:r>
+              <w:rPr>
+                <w:b/>
+                <w:bCs/>
+                <w:noProof/>
+                <w:webHidden/>
+                <w:sz w:val="28"/>
+                <w:szCs w:val="28"/>
+              </w:rPr>
+              <w:t>6</w:t>
+            </w:r>
+            <w:r>
+              <w:rPr>
+                <w:b/>
+                <w:bCs/>
+                <w:noProof/>
+                <w:webHidden/>
+                <w:sz w:val="28"/>
+                <w:szCs w:val="28"/>
+              </w:rPr>
+              <w:fldChar w:fldCharType="end"/>
+            </w:r>
+          </w:hyperlink>
+        </w:p>
+        <w:p>
+          <w:pPr>
+            <w:pStyle w:val="TOC2"/>
+            <w:tabs>
+              <w:tab w:val="right" w:leader="dot" w:pos="9350"/>
+            </w:tabs>
+            <w:rPr>
+              <w:b/>
+              <w:bCs/>
+              <w:noProof/>
+              <w:sz w:val="28"/>
+              <w:szCs w:val="28"/>
+            </w:rPr>
+          </w:pPr>
+          <w:hyperlink w:anchor="_Toc224819604" w:history="1">
+            <w:r>
+              <w:rPr>
+                <w:rStyle w:val="Hyperlink"/>
+                <w:b/>
+                <w:bCs/>
+                <w:noProof/>
+                <w:sz w:val="28"/>
+                <w:szCs w:val="28"/>
+              </w:rPr>
+              <w:t>4.5 Responsive Design</w:t>
+            </w:r>
+            <w:r>
+              <w:rPr>
+                <w:b/>
+                <w:bCs/>
+                <w:noProof/>
+                <w:webHidden/>
+                <w:sz w:val="28"/>
+                <w:szCs w:val="28"/>
+              </w:rPr>
+              <w:tab/>
+            </w:r>
+            <w:r>
+              <w:rPr>
+                <w:b/>
+                <w:bCs/>
+                <w:noProof/>
+                <w:webHidden/>
+                <w:sz w:val="28"/>
+                <w:szCs w:val="28"/>
+              </w:rPr>
+              <w:fldChar w:fldCharType="begin"/>
+            </w:r>
+            <w:r>
+              <w:rPr>
+                <w:b/>
+                <w:bCs/>
+                <w:noProof/>
+                <w:webHidden/>
+                <w:sz w:val="28"/>
+                <w:szCs w:val="28"/>
+              </w:rPr>
+              <w:instrText xml:space="preserve"> PAGEREF _Toc224819604 \h </w:instrText>
+            </w:r>
+            <w:r>
+              <w:rPr>
+                <w:b/>
+                <w:bCs/>
+                <w:noProof/>
+                <w:webHidden/>
+                <w:sz w:val="28"/>
+                <w:szCs w:val="28"/>
+              </w:rPr>
+            </w:r>
+            <w:r>
+              <w:rPr>
+                <w:b/>
+                <w:bCs/>
+                <w:noProof/>
+                <w:webHidden/>
+                <w:sz w:val="28"/>
+                <w:szCs w:val="28"/>
+              </w:rPr>
+              <w:fldChar w:fldCharType="separate"/>
+            </w:r>
+            <w:r>
+              <w:rPr>
+                <w:b/>
+                <w:bCs/>
+                <w:noProof/>
+                <w:webHidden/>
+                <w:sz w:val="28"/>
+                <w:szCs w:val="28"/>
+              </w:rPr>
+              <w:t>6</w:t>
+            </w:r>
+            <w:r>
+              <w:rPr>
+                <w:b/>
+                <w:bCs/>
+                <w:noProof/>
+                <w:webHidden/>
+                <w:sz w:val="28"/>
+                <w:szCs w:val="28"/>
+              </w:rPr>
+              <w:fldChar w:fldCharType="end"/>
+            </w:r>
+          </w:hyperlink>
+        </w:p>
+        <w:p>
+          <w:pPr>
+            <w:pStyle w:val="TOC2"/>
+            <w:tabs>
+              <w:tab w:val="right" w:leader="dot" w:pos="9350"/>
+            </w:tabs>
+            <w:rPr>
+              <w:b/>
+              <w:bCs/>
+              <w:noProof/>
+              <w:sz w:val="28"/>
+              <w:szCs w:val="28"/>
+            </w:rPr>
+          </w:pPr>
+          <w:hyperlink w:anchor="_Toc224819605" w:history="1">
+            <w:r>
+              <w:rPr>
+                <w:rStyle w:val="Hyperlink"/>
+                <w:b/>
+                <w:bCs/>
+                <w:noProof/>
+                <w:sz w:val="28"/>
+                <w:szCs w:val="28"/>
+              </w:rPr>
+              <w:t>4.6 CSS Custom Properties</w:t>
+            </w:r>
+            <w:r>
+              <w:rPr>
+                <w:b/>
+                <w:bCs/>
+                <w:noProof/>
+                <w:webHidden/>
+                <w:sz w:val="28"/>
+                <w:szCs w:val="28"/>
+              </w:rPr>
+              <w:tab/>
+            </w:r>
+            <w:r>
+              <w:rPr>
+                <w:b/>
+                <w:bCs/>
+                <w:noProof/>
+                <w:webHidden/>
+                <w:sz w:val="28"/>
+                <w:szCs w:val="28"/>
+              </w:rPr>
+              <w:fldChar w:fldCharType="begin"/>
+            </w:r>
+            <w:r>
+              <w:rPr>
+                <w:b/>
+                <w:bCs/>
+                <w:noProof/>
+                <w:webHidden/>
+                <w:sz w:val="28"/>
+                <w:szCs w:val="28"/>
+              </w:rPr>
+              <w:instrText xml:space="preserve"> PAGEREF _Toc224819605 \h </w:instrText>
+            </w:r>
+            <w:r>
+              <w:rPr>
+                <w:b/>
+                <w:bCs/>
+                <w:noProof/>
+                <w:webHidden/>
+                <w:sz w:val="28"/>
+                <w:szCs w:val="28"/>
+              </w:rPr>
+            </w:r>
+            <w:r>
+              <w:rPr>
+                <w:b/>
+                <w:bCs/>
+                <w:noProof/>
+                <w:webHidden/>
+                <w:sz w:val="28"/>
+                <w:szCs w:val="28"/>
+              </w:rPr>
+              <w:fldChar w:fldCharType="separate"/>
+            </w:r>
+            <w:r>
+              <w:rPr>
+                <w:b/>
+                <w:bCs/>
+                <w:noProof/>
+                <w:webHidden/>
+                <w:sz w:val="28"/>
+                <w:szCs w:val="28"/>
+              </w:rPr>
+              <w:t>6</w:t>
+            </w:r>
+            <w:r>
+              <w:rPr>
+                <w:b/>
+                <w:bCs/>
+                <w:noProof/>
+                <w:webHidden/>
+                <w:sz w:val="28"/>
+                <w:szCs w:val="28"/>
+              </w:rPr>
+              <w:fldChar w:fldCharType="end"/>
+            </w:r>
+          </w:hyperlink>
+        </w:p>
+        <w:p>
+          <w:pPr>
+            <w:pStyle w:val="TOC1"/>
+            <w:tabs>
+              <w:tab w:val="right" w:leader="dot" w:pos="9350"/>
+            </w:tabs>
+            <w:rPr>
+              <w:b/>
+              <w:bCs/>
+              <w:noProof/>
+              <w:sz w:val="28"/>
+              <w:szCs w:val="28"/>
+            </w:rPr>
+          </w:pPr>
+          <w:hyperlink w:anchor="_Toc224819606" w:history="1">
+            <w:r>
+              <w:rPr>
+                <w:rStyle w:val="Hyperlink"/>
+                <w:b/>
+                <w:bCs/>
+                <w:noProof/>
+                <w:sz w:val="28"/>
+                <w:szCs w:val="28"/>
+              </w:rPr>
+              <w:t>5. Bootstrap 5</w:t>
+            </w:r>
+            <w:r>
+              <w:rPr>
+                <w:b/>
+                <w:bCs/>
+                <w:noProof/>
+                <w:webHidden/>
+                <w:sz w:val="28"/>
+                <w:szCs w:val="28"/>
+              </w:rPr>
+              <w:tab/>
+            </w:r>
+            <w:r>
+              <w:rPr>
+                <w:b/>
+                <w:bCs/>
+                <w:noProof/>
+                <w:webHidden/>
+                <w:sz w:val="28"/>
+                <w:szCs w:val="28"/>
+              </w:rPr>
+              <w:fldChar w:fldCharType="begin"/>
+            </w:r>
+            <w:r>
+              <w:rPr>
+                <w:b/>
+                <w:bCs/>
+                <w:noProof/>
+                <w:webHidden/>
+                <w:sz w:val="28"/>
+                <w:szCs w:val="28"/>
+              </w:rPr>
+              <w:instrText xml:space="preserve"> PAGEREF _Toc224819606 \h </w:instrText>
+            </w:r>
+            <w:r>
+              <w:rPr>
+                <w:b/>
+                <w:bCs/>
+                <w:noProof/>
+                <w:webHidden/>
+                <w:sz w:val="28"/>
+                <w:szCs w:val="28"/>
+              </w:rPr>
+            </w:r>
+            <w:r>
+              <w:rPr>
+                <w:b/>
+                <w:bCs/>
+                <w:noProof/>
+                <w:webHidden/>
+                <w:sz w:val="28"/>
+                <w:szCs w:val="28"/>
+              </w:rPr>
+              <w:fldChar w:fldCharType="separate"/>
+            </w:r>
+            <w:r>
+              <w:rPr>
+                <w:b/>
+                <w:bCs/>
+                <w:noProof/>
+                <w:webHidden/>
+                <w:sz w:val="28"/>
+                <w:szCs w:val="28"/>
+              </w:rPr>
+              <w:t>7</w:t>
+            </w:r>
+            <w:r>
+              <w:rPr>
+                <w:b/>
+                <w:bCs/>
+                <w:noProof/>
+                <w:webHidden/>
+                <w:sz w:val="28"/>
+                <w:szCs w:val="28"/>
+              </w:rPr>
+              <w:fldChar w:fldCharType="end"/>
+            </w:r>
+          </w:hyperlink>
+        </w:p>
+        <w:p>
+          <w:pPr>
+            <w:pStyle w:val="TOC2"/>
+            <w:tabs>
+              <w:tab w:val="right" w:leader="dot" w:pos="9350"/>
+            </w:tabs>
+            <w:rPr>
+              <w:b/>
+              <w:bCs/>
+              <w:noProof/>
+              <w:sz w:val="28"/>
+              <w:szCs w:val="28"/>
+            </w:rPr>
+          </w:pPr>
+          <w:hyperlink w:anchor="_Toc224819607" w:history="1">
+            <w:r>
+              <w:rPr>
+                <w:rStyle w:val="Hyperlink"/>
+                <w:b/>
+                <w:bCs/>
+                <w:noProof/>
+                <w:sz w:val="28"/>
+                <w:szCs w:val="28"/>
+              </w:rPr>
+              <w:t>5.1 The Grid System</w:t>
+            </w:r>
+            <w:r>
+              <w:rPr>
+                <w:b/>
+                <w:bCs/>
+                <w:noProof/>
+                <w:webHidden/>
+                <w:sz w:val="28"/>
+                <w:szCs w:val="28"/>
+              </w:rPr>
+              <w:tab/>
+            </w:r>
+            <w:r>
+              <w:rPr>
+                <w:b/>
+                <w:bCs/>
+                <w:noProof/>
+                <w:webHidden/>
+                <w:sz w:val="28"/>
+                <w:szCs w:val="28"/>
+              </w:rPr>
+              <w:fldChar w:fldCharType="begin"/>
+            </w:r>
+            <w:r>
+              <w:rPr>
+                <w:b/>
+                <w:bCs/>
+                <w:noProof/>
+                <w:webHidden/>
+                <w:sz w:val="28"/>
+                <w:szCs w:val="28"/>
+              </w:rPr>
+              <w:instrText xml:space="preserve"> PAGEREF _Toc224819607 \h </w:instrText>
+            </w:r>
+            <w:r>
+              <w:rPr>
+                <w:b/>
+                <w:bCs/>
+                <w:noProof/>
+                <w:webHidden/>
+                <w:sz w:val="28"/>
+                <w:szCs w:val="28"/>
+              </w:rPr>
+            </w:r>
+            <w:r>
+              <w:rPr>
+                <w:b/>
+                <w:bCs/>
+                <w:noProof/>
+                <w:webHidden/>
+                <w:sz w:val="28"/>
+                <w:szCs w:val="28"/>
+              </w:rPr>
+              <w:fldChar w:fldCharType="separate"/>
+            </w:r>
+            <w:r>
+              <w:rPr>
+                <w:b/>
+                <w:bCs/>
+                <w:noProof/>
+                <w:webHidden/>
+                <w:sz w:val="28"/>
+                <w:szCs w:val="28"/>
+              </w:rPr>
+              <w:t>7</w:t>
+            </w:r>
+            <w:r>
+              <w:rPr>
+                <w:b/>
+                <w:bCs/>
+                <w:noProof/>
+                <w:webHidden/>
+                <w:sz w:val="28"/>
+                <w:szCs w:val="28"/>
+              </w:rPr>
+              <w:fldChar w:fldCharType="end"/>
+            </w:r>
+          </w:hyperlink>
+        </w:p>
+        <w:p>
+          <w:pPr>
+            <w:pStyle w:val="TOC2"/>
+            <w:tabs>
+              <w:tab w:val="right" w:leader="dot" w:pos="9350"/>
+            </w:tabs>
+            <w:rPr>
+              <w:b/>
+              <w:bCs/>
+              <w:noProof/>
+              <w:sz w:val="28"/>
+              <w:szCs w:val="28"/>
+            </w:rPr>
+          </w:pPr>
+          <w:hyperlink w:anchor="_Toc224819608" w:history="1">
+            <w:r>
+              <w:rPr>
+                <w:rStyle w:val="Hyperlink"/>
+                <w:b/>
+                <w:bCs/>
+                <w:noProof/>
+                <w:sz w:val="28"/>
+                <w:szCs w:val="28"/>
+              </w:rPr>
+              <w:t>5.2 Components</w:t>
+            </w:r>
+            <w:r>
+              <w:rPr>
+                <w:b/>
+                <w:bCs/>
+                <w:noProof/>
+                <w:webHidden/>
+                <w:sz w:val="28"/>
+                <w:szCs w:val="28"/>
+              </w:rPr>
+              <w:tab/>
+            </w:r>
+            <w:r>
+              <w:rPr>
+                <w:b/>
+                <w:bCs/>
+                <w:noProof/>
+                <w:webHidden/>
+                <w:sz w:val="28"/>
+                <w:szCs w:val="28"/>
+              </w:rPr>
+              <w:fldChar w:fldCharType="begin"/>
+            </w:r>
+            <w:r>
+              <w:rPr>
+                <w:b/>
+                <w:bCs/>
+                <w:noProof/>
+                <w:webHidden/>
+                <w:sz w:val="28"/>
+                <w:szCs w:val="28"/>
+              </w:rPr>
+              <w:instrText xml:space="preserve"> PAGEREF _Toc224819608 \h </w:instrText>
+            </w:r>
+            <w:r>
+              <w:rPr>
+                <w:b/>
+                <w:bCs/>
+                <w:noProof/>
+                <w:webHidden/>
+                <w:sz w:val="28"/>
+                <w:szCs w:val="28"/>
+              </w:rPr>
+            </w:r>
+            <w:r>
+              <w:rPr>
+                <w:b/>
+                <w:bCs/>
+                <w:noProof/>
+                <w:webHidden/>
+                <w:sz w:val="28"/>
+                <w:szCs w:val="28"/>
+              </w:rPr>
+              <w:fldChar w:fldCharType="separate"/>
+            </w:r>
+            <w:r>
+              <w:rPr>
+                <w:b/>
+                <w:bCs/>
+                <w:noProof/>
+                <w:webHidden/>
+                <w:sz w:val="28"/>
+                <w:szCs w:val="28"/>
+              </w:rPr>
+              <w:t>7</w:t>
+            </w:r>
+            <w:r>
+              <w:rPr>
+                <w:b/>
+                <w:bCs/>
+                <w:noProof/>
+                <w:webHidden/>
+                <w:sz w:val="28"/>
+                <w:szCs w:val="28"/>
+              </w:rPr>
+              <w:fldChar w:fldCharType="end"/>
+            </w:r>
+          </w:hyperlink>
+        </w:p>
+        <w:p>
+          <w:pPr>
+            <w:pStyle w:val="TOC2"/>
+            <w:tabs>
+              <w:tab w:val="right" w:leader="dot" w:pos="9350"/>
+            </w:tabs>
+            <w:rPr>
+              <w:b/>
+              <w:bCs/>
+              <w:noProof/>
+              <w:sz w:val="28"/>
+              <w:szCs w:val="28"/>
+            </w:rPr>
+          </w:pPr>
+          <w:hyperlink w:anchor="_Toc224819609" w:history="1">
+            <w:r>
+              <w:rPr>
+                <w:rStyle w:val="Hyperlink"/>
+                <w:b/>
+                <w:bCs/>
+                <w:noProof/>
+                <w:sz w:val="28"/>
+                <w:szCs w:val="28"/>
+              </w:rPr>
+              <w:t>5.3 Utility Classes</w:t>
+            </w:r>
+            <w:r>
+              <w:rPr>
+                <w:b/>
+                <w:bCs/>
+                <w:noProof/>
+                <w:webHidden/>
+                <w:sz w:val="28"/>
+                <w:szCs w:val="28"/>
+              </w:rPr>
+              <w:tab/>
+            </w:r>
+            <w:r>
+              <w:rPr>
+                <w:b/>
+                <w:bCs/>
+                <w:noProof/>
+                <w:webHidden/>
+                <w:sz w:val="28"/>
+                <w:szCs w:val="28"/>
+              </w:rPr>
+              <w:fldChar w:fldCharType="begin"/>
+            </w:r>
+            <w:r>
+              <w:rPr>
+                <w:b/>
+                <w:bCs/>
+                <w:noProof/>
+                <w:webHidden/>
+                <w:sz w:val="28"/>
+                <w:szCs w:val="28"/>
+              </w:rPr>
+              <w:instrText xml:space="preserve"> PAGEREF _Toc224819609 \h </w:instrText>
+            </w:r>
+            <w:r>
+              <w:rPr>
+                <w:b/>
+                <w:bCs/>
+                <w:noProof/>
+                <w:webHidden/>
+                <w:sz w:val="28"/>
+                <w:szCs w:val="28"/>
+              </w:rPr>
+            </w:r>
+            <w:r>
+              <w:rPr>
+                <w:b/>
+                <w:bCs/>
+                <w:noProof/>
+                <w:webHidden/>
+                <w:sz w:val="28"/>
+                <w:szCs w:val="28"/>
+              </w:rPr>
+              <w:fldChar w:fldCharType="separate"/>
+            </w:r>
+            <w:r>
+              <w:rPr>
+                <w:b/>
+                <w:bCs/>
+                <w:noProof/>
+                <w:webHidden/>
+                <w:sz w:val="28"/>
+                <w:szCs w:val="28"/>
+              </w:rPr>
+              <w:t>7</w:t>
+            </w:r>
+            <w:r>
+              <w:rPr>
+                <w:b/>
+                <w:bCs/>
+                <w:noProof/>
+                <w:webHidden/>
+                <w:sz w:val="28"/>
+                <w:szCs w:val="28"/>
+              </w:rPr>
+              <w:fldChar w:fldCharType="end"/>
+            </w:r>
+          </w:hyperlink>
+        </w:p>
+        <w:p>
+          <w:pPr>
+            <w:pStyle w:val="TOC2"/>
+            <w:tabs>
+              <w:tab w:val="right" w:leader="dot" w:pos="9350"/>
+            </w:tabs>
+            <w:rPr>
+              <w:b/>
+              <w:bCs/>
+              <w:noProof/>
+              <w:sz w:val="28"/>
+              <w:szCs w:val="28"/>
+            </w:rPr>
+          </w:pPr>
+          <w:hyperlink w:anchor="_Toc224819610" w:history="1">
+            <w:r>
+              <w:rPr>
+                <w:rStyle w:val="Hyperlink"/>
+                <w:b/>
+                <w:bCs/>
+                <w:noProof/>
+                <w:sz w:val="28"/>
+                <w:szCs w:val="28"/>
+              </w:rPr>
+              <w:t>5.4 JavaScript Plugins</w:t>
+            </w:r>
+            <w:r>
+              <w:rPr>
+                <w:b/>
+                <w:bCs/>
+                <w:noProof/>
+                <w:webHidden/>
+                <w:sz w:val="28"/>
+                <w:szCs w:val="28"/>
+              </w:rPr>
+              <w:tab/>
+            </w:r>
+            <w:r>
+              <w:rPr>
+                <w:b/>
+                <w:bCs/>
+                <w:noProof/>
+                <w:webHidden/>
+                <w:sz w:val="28"/>
+                <w:szCs w:val="28"/>
+              </w:rPr>
+              <w:fldChar w:fldCharType="begin"/>
+            </w:r>
+            <w:r>
+              <w:rPr>
+                <w:b/>
+                <w:bCs/>
+                <w:noProof/>
+                <w:webHidden/>
+                <w:sz w:val="28"/>
+                <w:szCs w:val="28"/>
+              </w:rPr>
+              <w:instrText xml:space="preserve"> PAGEREF _Toc224819610 \h </w:instrText>
+            </w:r>
+            <w:r>
+              <w:rPr>
+                <w:b/>
+                <w:bCs/>
+                <w:noProof/>
+                <w:webHidden/>
+                <w:sz w:val="28"/>
+                <w:szCs w:val="28"/>
+              </w:rPr>
+            </w:r>
+            <w:r>
+              <w:rPr>
+                <w:b/>
+                <w:bCs/>
+                <w:noProof/>
+                <w:webHidden/>
+                <w:sz w:val="28"/>
+                <w:szCs w:val="28"/>
+              </w:rPr>
+              <w:fldChar w:fldCharType="separate"/>
+            </w:r>
+            <w:r>
+              <w:rPr>
+                <w:b/>
+                <w:bCs/>
+                <w:noProof/>
+                <w:webHidden/>
+                <w:sz w:val="28"/>
+                <w:szCs w:val="28"/>
+              </w:rPr>
+              <w:t>7</w:t>
+            </w:r>
+            <w:r>
+              <w:rPr>
+                <w:b/>
+                <w:bCs/>
+                <w:noProof/>
+                <w:webHidden/>
+                <w:sz w:val="28"/>
+                <w:szCs w:val="28"/>
+              </w:rPr>
+              <w:fldChar w:fldCharType="end"/>
+            </w:r>
+          </w:hyperlink>
+        </w:p>
+        <w:p>
+          <w:pPr>
+            <w:pStyle w:val="TOC1"/>
+            <w:tabs>
+              <w:tab w:val="right" w:leader="dot" w:pos="9350"/>
+            </w:tabs>
+            <w:rPr>
+              <w:b/>
+              <w:bCs/>
+              <w:noProof/>
+              <w:sz w:val="28"/>
+              <w:szCs w:val="28"/>
+            </w:rPr>
+          </w:pPr>
+          <w:hyperlink w:anchor="_Toc224819611" w:history="1">
+            <w:r>
+              <w:rPr>
+                <w:rStyle w:val="Hyperlink"/>
+                <w:b/>
+                <w:bCs/>
+                <w:noProof/>
+                <w:sz w:val="28"/>
+                <w:szCs w:val="28"/>
+              </w:rPr>
+              <w:t>6. JavaScript</w:t>
+            </w:r>
+            <w:r>
+              <w:rPr>
+                <w:b/>
+                <w:bCs/>
+                <w:noProof/>
+                <w:webHidden/>
+                <w:sz w:val="28"/>
+                <w:szCs w:val="28"/>
+              </w:rPr>
+              <w:tab/>
+            </w:r>
+            <w:r>
+              <w:rPr>
+                <w:b/>
+                <w:bCs/>
+                <w:noProof/>
+                <w:webHidden/>
+                <w:sz w:val="28"/>
+                <w:szCs w:val="28"/>
+              </w:rPr>
+              <w:fldChar w:fldCharType="begin"/>
+            </w:r>
+            <w:r>
+              <w:rPr>
+                <w:b/>
+                <w:bCs/>
+                <w:noProof/>
+                <w:webHidden/>
+                <w:sz w:val="28"/>
+                <w:szCs w:val="28"/>
+              </w:rPr>
+              <w:instrText xml:space="preserve"> PAGEREF _Toc224819611 \h </w:instrText>
+            </w:r>
+            <w:r>
+              <w:rPr>
+                <w:b/>
+                <w:bCs/>
+                <w:noProof/>
+                <w:webHidden/>
+                <w:sz w:val="28"/>
+                <w:szCs w:val="28"/>
+              </w:rPr>
+            </w:r>
+            <w:r>
+              <w:rPr>
+                <w:b/>
+                <w:bCs/>
+                <w:noProof/>
+                <w:webHidden/>
+                <w:sz w:val="28"/>
+                <w:szCs w:val="28"/>
+              </w:rPr>
+              <w:fldChar w:fldCharType="separate"/>
+            </w:r>
+            <w:r>
+              <w:rPr>
+                <w:b/>
+                <w:bCs/>
+                <w:noProof/>
+                <w:webHidden/>
+                <w:sz w:val="28"/>
+                <w:szCs w:val="28"/>
+              </w:rPr>
+              <w:t>8</w:t>
+            </w:r>
+            <w:r>
+              <w:rPr>
+                <w:b/>
+                <w:bCs/>
+                <w:noProof/>
+                <w:webHidden/>
+                <w:sz w:val="28"/>
+                <w:szCs w:val="28"/>
+              </w:rPr>
+              <w:fldChar w:fldCharType="end"/>
+            </w:r>
+          </w:hyperlink>
+        </w:p>
+        <w:p>
+          <w:pPr>
+            <w:pStyle w:val="TOC2"/>
+            <w:tabs>
+              <w:tab w:val="right" w:leader="dot" w:pos="9350"/>
+            </w:tabs>
+            <w:rPr>
+              <w:b/>
+              <w:bCs/>
+              <w:noProof/>
+              <w:sz w:val="28"/>
+              <w:szCs w:val="28"/>
+            </w:rPr>
+          </w:pPr>
+          <w:hyperlink w:anchor="_Toc224819612" w:history="1">
+            <w:r>
+              <w:rPr>
+                <w:rStyle w:val="Hyperlink"/>
+                <w:b/>
+                <w:bCs/>
+                <w:noProof/>
+                <w:sz w:val="28"/>
+                <w:szCs w:val="28"/>
+              </w:rPr>
+              <w:t>6.1 DOM Manipulation</w:t>
+            </w:r>
+            <w:r>
+              <w:rPr>
+                <w:b/>
+                <w:bCs/>
+                <w:noProof/>
+                <w:webHidden/>
+                <w:sz w:val="28"/>
+                <w:szCs w:val="28"/>
+              </w:rPr>
+              <w:tab/>
+            </w:r>
+            <w:r>
+              <w:rPr>
+                <w:b/>
+                <w:bCs/>
+                <w:noProof/>
+                <w:webHidden/>
+                <w:sz w:val="28"/>
+                <w:szCs w:val="28"/>
+              </w:rPr>
+              <w:fldChar w:fldCharType="begin"/>
+            </w:r>
+            <w:r>
+              <w:rPr>
+                <w:b/>
+                <w:bCs/>
+                <w:noProof/>
+                <w:webHidden/>
+                <w:sz w:val="28"/>
+                <w:szCs w:val="28"/>
+              </w:rPr>
+              <w:instrText xml:space="preserve"> PAGEREF _Toc224819612 \h </w:instrText>
+            </w:r>
+            <w:r>
+              <w:rPr>
+                <w:b/>
+                <w:bCs/>
+                <w:noProof/>
+                <w:webHidden/>
+                <w:sz w:val="28"/>
+                <w:szCs w:val="28"/>
+              </w:rPr>
+            </w:r>
+            <w:r>
+              <w:rPr>
+                <w:b/>
+                <w:bCs/>
+                <w:noProof/>
+                <w:webHidden/>
+                <w:sz w:val="28"/>
+                <w:szCs w:val="28"/>
+              </w:rPr>
+              <w:fldChar w:fldCharType="separate"/>
+            </w:r>
+            <w:r>
+              <w:rPr>
+                <w:b/>
+                <w:bCs/>
+                <w:noProof/>
+                <w:webHidden/>
+                <w:sz w:val="28"/>
+                <w:szCs w:val="28"/>
+              </w:rPr>
+              <w:t>8</w:t>
+            </w:r>
+            <w:r>
+              <w:rPr>
+                <w:b/>
+                <w:bCs/>
+                <w:noProof/>
+                <w:webHidden/>
+                <w:sz w:val="28"/>
+                <w:szCs w:val="28"/>
+              </w:rPr>
+              <w:fldChar w:fldCharType="end"/>
+            </w:r>
+          </w:hyperlink>
+        </w:p>
+        <w:p>
+          <w:pPr>
+            <w:pStyle w:val="TOC2"/>
+            <w:tabs>
+              <w:tab w:val="right" w:leader="dot" w:pos="9350"/>
+            </w:tabs>
+            <w:rPr>
+              <w:b/>
+              <w:bCs/>
+              <w:noProof/>
+              <w:sz w:val="28"/>
+              <w:szCs w:val="28"/>
+            </w:rPr>
+          </w:pPr>
+          <w:hyperlink w:anchor="_Toc224819613" w:history="1">
+            <w:r>
+              <w:rPr>
+                <w:rStyle w:val="Hyperlink"/>
+                <w:b/>
+                <w:bCs/>
+                <w:noProof/>
+                <w:sz w:val="28"/>
+                <w:szCs w:val="28"/>
+              </w:rPr>
+              <w:t>6.2 Event Listeners</w:t>
+            </w:r>
+            <w:r>
+              <w:rPr>
+                <w:b/>
+                <w:bCs/>
+                <w:noProof/>
+                <w:webHidden/>
+                <w:sz w:val="28"/>
+                <w:szCs w:val="28"/>
+              </w:rPr>
+              <w:tab/>
+            </w:r>
+            <w:r>
+              <w:rPr>
+                <w:b/>
+                <w:bCs/>
+                <w:noProof/>
+                <w:webHidden/>
+                <w:sz w:val="28"/>
+                <w:szCs w:val="28"/>
+              </w:rPr>
+              <w:fldChar w:fldCharType="begin"/>
+            </w:r>
+            <w:r>
+              <w:rPr>
+                <w:b/>
+                <w:bCs/>
+                <w:noProof/>
+                <w:webHidden/>
+                <w:sz w:val="28"/>
+                <w:szCs w:val="28"/>
+              </w:rPr>
+              <w:instrText xml:space="preserve"> PAGEREF _Toc224819613 \h </w:instrText>
+            </w:r>
+            <w:r>
+              <w:rPr>
+                <w:b/>
+                <w:bCs/>
+                <w:noProof/>
+                <w:webHidden/>
+                <w:sz w:val="28"/>
+                <w:szCs w:val="28"/>
+              </w:rPr>
+            </w:r>
+            <w:r>
+              <w:rPr>
+                <w:b/>
+                <w:bCs/>
+                <w:noProof/>
+                <w:webHidden/>
+                <w:sz w:val="28"/>
+                <w:szCs w:val="28"/>
+              </w:rPr>
+              <w:fldChar w:fldCharType="separate"/>
+            </w:r>
+            <w:r>
+              <w:rPr>
+                <w:b/>
+                <w:bCs/>
+                <w:noProof/>
+                <w:webHidden/>
+                <w:sz w:val="28"/>
+                <w:szCs w:val="28"/>
+              </w:rPr>
+              <w:t>8</w:t>
+            </w:r>
+            <w:r>
+              <w:rPr>
+                <w:b/>
+                <w:bCs/>
+                <w:noProof/>
+                <w:webHidden/>
+                <w:sz w:val="28"/>
+                <w:szCs w:val="28"/>
+              </w:rPr>
+              <w:fldChar w:fldCharType="end"/>
+            </w:r>
+          </w:hyperlink>
+        </w:p>
+        <w:p>
+          <w:pPr>
+            <w:pStyle w:val="TOC2"/>
+            <w:tabs>
+              <w:tab w:val="right" w:leader="dot" w:pos="9350"/>
+            </w:tabs>
+            <w:rPr>
+              <w:b/>
+              <w:bCs/>
+              <w:noProof/>
+              <w:sz w:val="28"/>
+              <w:szCs w:val="28"/>
+            </w:rPr>
+          </w:pPr>
+          <w:hyperlink w:anchor="_Toc224819614" w:history="1">
+            <w:r>
+              <w:rPr>
+                <w:rStyle w:val="Hyperlink"/>
+                <w:b/>
+                <w:bCs/>
+                <w:noProof/>
+                <w:sz w:val="28"/>
+                <w:szCs w:val="28"/>
+              </w:rPr>
+              <w:t>6.3 ES6 Features</w:t>
+            </w:r>
+            <w:r>
+              <w:rPr>
+                <w:b/>
+                <w:bCs/>
+                <w:noProof/>
+                <w:webHidden/>
+                <w:sz w:val="28"/>
+                <w:szCs w:val="28"/>
+              </w:rPr>
+              <w:tab/>
+            </w:r>
+            <w:r>
+              <w:rPr>
+                <w:b/>
+                <w:bCs/>
+                <w:noProof/>
+                <w:webHidden/>
+                <w:sz w:val="28"/>
+                <w:szCs w:val="28"/>
+              </w:rPr>
+              <w:fldChar w:fldCharType="begin"/>
+            </w:r>
+            <w:r>
+              <w:rPr>
+                <w:b/>
+                <w:bCs/>
+                <w:noProof/>
+                <w:webHidden/>
+                <w:sz w:val="28"/>
+                <w:szCs w:val="28"/>
+              </w:rPr>
+              <w:instrText xml:space="preserve"> PAGEREF _Toc224819614 \h </w:instrText>
+            </w:r>
+            <w:r>
+              <w:rPr>
+                <w:b/>
+                <w:bCs/>
+                <w:noProof/>
+                <w:webHidden/>
+                <w:sz w:val="28"/>
+                <w:szCs w:val="28"/>
+              </w:rPr>
+            </w:r>
+            <w:r>
+              <w:rPr>
+                <w:b/>
+                <w:bCs/>
+                <w:noProof/>
+                <w:webHidden/>
+                <w:sz w:val="28"/>
+                <w:szCs w:val="28"/>
+              </w:rPr>
+              <w:fldChar w:fldCharType="separate"/>
+            </w:r>
+            <w:r>
+              <w:rPr>
+                <w:b/>
+                <w:bCs/>
+                <w:noProof/>
+                <w:webHidden/>
+                <w:sz w:val="28"/>
+                <w:szCs w:val="28"/>
+              </w:rPr>
+              <w:t>8</w:t>
+            </w:r>
+            <w:r>
+              <w:rPr>
+                <w:b/>
+                <w:bCs/>
+                <w:noProof/>
+                <w:webHidden/>
+                <w:sz w:val="28"/>
+                <w:szCs w:val="28"/>
+              </w:rPr>
+              <w:fldChar w:fldCharType="end"/>
+            </w:r>
+          </w:hyperlink>
+        </w:p>
+        <w:p>
+          <w:pPr>
+            <w:pStyle w:val="TOC2"/>
+            <w:tabs>
+              <w:tab w:val="right" w:leader="dot" w:pos="9350"/>
+            </w:tabs>
+            <w:rPr>
+              <w:b/>
+              <w:bCs/>
+              <w:noProof/>
+              <w:sz w:val="28"/>
+              <w:szCs w:val="28"/>
+            </w:rPr>
+          </w:pPr>
+          <w:hyperlink w:anchor="_Toc224819615" w:history="1">
+            <w:r>
+              <w:rPr>
+                <w:rStyle w:val="Hyperlink"/>
+                <w:b/>
+                <w:bCs/>
+                <w:noProof/>
+                <w:sz w:val="28"/>
+                <w:szCs w:val="28"/>
+              </w:rPr>
+              <w:t>6.4 Form Validation</w:t>
+            </w:r>
+            <w:r>
+              <w:rPr>
+                <w:b/>
+                <w:bCs/>
+                <w:noProof/>
+                <w:webHidden/>
+                <w:sz w:val="28"/>
+                <w:szCs w:val="28"/>
+              </w:rPr>
+              <w:tab/>
+            </w:r>
+            <w:r>
+              <w:rPr>
+                <w:b/>
+                <w:bCs/>
+                <w:noProof/>
+                <w:webHidden/>
+                <w:sz w:val="28"/>
+                <w:szCs w:val="28"/>
+              </w:rPr>
+              <w:fldChar w:fldCharType="begin"/>
+            </w:r>
+            <w:r>
+              <w:rPr>
+                <w:b/>
+                <w:bCs/>
+                <w:noProof/>
+                <w:webHidden/>
+                <w:sz w:val="28"/>
+                <w:szCs w:val="28"/>
+              </w:rPr>
+              <w:instrText xml:space="preserve"> PAGEREF _Toc224819615 \h </w:instrText>
+            </w:r>
+            <w:r>
+              <w:rPr>
+                <w:b/>
+                <w:bCs/>
+                <w:noProof/>
+                <w:webHidden/>
+                <w:sz w:val="28"/>
+                <w:szCs w:val="28"/>
+              </w:rPr>
+            </w:r>
+            <w:r>
+              <w:rPr>
+                <w:b/>
+                <w:bCs/>
+                <w:noProof/>
+                <w:webHidden/>
+                <w:sz w:val="28"/>
+                <w:szCs w:val="28"/>
+              </w:rPr>
+              <w:fldChar w:fldCharType="separate"/>
+            </w:r>
+            <w:r>
+              <w:rPr>
+                <w:b/>
+                <w:bCs/>
+                <w:noProof/>
+                <w:webHidden/>
+                <w:sz w:val="28"/>
+                <w:szCs w:val="28"/>
+              </w:rPr>
+              <w:t>8</w:t>
+            </w:r>
+            <w:r>
+              <w:rPr>
+                <w:b/>
+                <w:bCs/>
+                <w:noProof/>
+                <w:webHidden/>
+                <w:sz w:val="28"/>
+                <w:szCs w:val="28"/>
+              </w:rPr>
+              <w:fldChar w:fldCharType="end"/>
+            </w:r>
+          </w:hyperlink>
+        </w:p>
+        <w:p>
+          <w:pPr>
+            <w:pStyle w:val="TOC2"/>
+            <w:tabs>
+              <w:tab w:val="right" w:leader="dot" w:pos="9350"/>
+            </w:tabs>
+            <w:rPr>
+              <w:b/>
+              <w:bCs/>
+              <w:noProof/>
+              <w:sz w:val="28"/>
+              <w:szCs w:val="28"/>
+            </w:rPr>
+          </w:pPr>
+          <w:hyperlink w:anchor="_Toc224819616" w:history="1">
+            <w:r>
+              <w:rPr>
+                <w:rStyle w:val="Hyperlink"/>
+                <w:b/>
+                <w:bCs/>
+                <w:noProof/>
+                <w:sz w:val="28"/>
+                <w:szCs w:val="28"/>
+              </w:rPr>
+              <w:t>6.5 Array Methods</w:t>
+            </w:r>
+            <w:r>
+              <w:rPr>
+                <w:b/>
+                <w:bCs/>
+                <w:noProof/>
+                <w:webHidden/>
+                <w:sz w:val="28"/>
+                <w:szCs w:val="28"/>
+              </w:rPr>
+              <w:tab/>
+            </w:r>
+            <w:r>
+              <w:rPr>
+                <w:b/>
+                <w:bCs/>
+                <w:noProof/>
+                <w:webHidden/>
+                <w:sz w:val="28"/>
+                <w:szCs w:val="28"/>
+              </w:rPr>
+              <w:fldChar w:fldCharType="begin"/>
+            </w:r>
+            <w:r>
+              <w:rPr>
+                <w:b/>
+                <w:bCs/>
+                <w:noProof/>
+                <w:webHidden/>
+                <w:sz w:val="28"/>
+                <w:szCs w:val="28"/>
+              </w:rPr>
+              <w:instrText xml:space="preserve"> PAGEREF _Toc224819616 \h </w:instrText>
+            </w:r>
+            <w:r>
+              <w:rPr>
+                <w:b/>
+                <w:bCs/>
+                <w:noProof/>
+                <w:webHidden/>
+                <w:sz w:val="28"/>
+                <w:szCs w:val="28"/>
+              </w:rPr>
+            </w:r>
+            <w:r>
+              <w:rPr>
+                <w:b/>
+                <w:bCs/>
+                <w:noProof/>
+                <w:webHidden/>
+                <w:sz w:val="28"/>
+                <w:szCs w:val="28"/>
+              </w:rPr>
+              <w:fldChar w:fldCharType="separate"/>
+            </w:r>
+            <w:r>
+              <w:rPr>
+                <w:b/>
+                <w:bCs/>
+                <w:noProof/>
+                <w:webHidden/>
+                <w:sz w:val="28"/>
+                <w:szCs w:val="28"/>
+              </w:rPr>
+              <w:t>8</w:t>
+            </w:r>
+            <w:r>
+              <w:rPr>
+                <w:b/>
+                <w:bCs/>
+                <w:noProof/>
+                <w:webHidden/>
+                <w:sz w:val="28"/>
+                <w:szCs w:val="28"/>
+              </w:rPr>
+              <w:fldChar w:fldCharType="end"/>
+            </w:r>
+          </w:hyperlink>
+        </w:p>
+        <w:p>
+          <w:pPr>
+            <w:pStyle w:val="TOC2"/>
+            <w:tabs>
+              <w:tab w:val="right" w:leader="dot" w:pos="9350"/>
+            </w:tabs>
+            <w:rPr>
+              <w:b/>
+              <w:bCs/>
+              <w:noProof/>
+              <w:sz w:val="28"/>
+              <w:szCs w:val="28"/>
+            </w:rPr>
+          </w:pPr>
+          <w:hyperlink w:anchor="_Toc224819617" w:history="1">
+            <w:r>
+              <w:rPr>
+                <w:rStyle w:val="Hyperlink"/>
+                <w:b/>
+                <w:bCs/>
+                <w:noProof/>
+                <w:sz w:val="28"/>
+                <w:szCs w:val="28"/>
+              </w:rPr>
+              <w:t>6.6 Fetch API</w:t>
+            </w:r>
+            <w:r>
+              <w:rPr>
+                <w:b/>
+                <w:bCs/>
+                <w:noProof/>
+                <w:webHidden/>
+                <w:sz w:val="28"/>
+                <w:szCs w:val="28"/>
+              </w:rPr>
+              <w:tab/>
+            </w:r>
+            <w:r>
+              <w:rPr>
+                <w:b/>
+                <w:bCs/>
+                <w:noProof/>
+                <w:webHidden/>
+                <w:sz w:val="28"/>
+                <w:szCs w:val="28"/>
+              </w:rPr>
+              <w:fldChar w:fldCharType="begin"/>
+            </w:r>
+            <w:r>
+              <w:rPr>
+                <w:b/>
+                <w:bCs/>
+                <w:noProof/>
+                <w:webHidden/>
+                <w:sz w:val="28"/>
+                <w:szCs w:val="28"/>
+              </w:rPr>
+              <w:instrText xml:space="preserve"> PAGEREF _Toc224819617 \h </w:instrText>
+            </w:r>
+            <w:r>
+              <w:rPr>
+                <w:b/>
+                <w:bCs/>
+                <w:noProof/>
+                <w:webHidden/>
+                <w:sz w:val="28"/>
+                <w:szCs w:val="28"/>
+              </w:rPr>
+            </w:r>
+            <w:r>
+              <w:rPr>
+                <w:b/>
+                <w:bCs/>
+                <w:noProof/>
+                <w:webHidden/>
+                <w:sz w:val="28"/>
+                <w:szCs w:val="28"/>
+              </w:rPr>
+              <w:fldChar w:fldCharType="separate"/>
+            </w:r>
+            <w:r>
+              <w:rPr>
+                <w:b/>
+                <w:bCs/>
+                <w:noProof/>
+                <w:webHidden/>
+                <w:sz w:val="28"/>
+                <w:szCs w:val="28"/>
+              </w:rPr>
+              <w:t>8</w:t>
+            </w:r>
+            <w:r>
+              <w:rPr>
+                <w:b/>
+                <w:bCs/>
+                <w:noProof/>
+                <w:webHidden/>
+                <w:sz w:val="28"/>
+                <w:szCs w:val="28"/>
+              </w:rPr>
+              <w:fldChar w:fldCharType="end"/>
+            </w:r>
+          </w:hyperlink>
+        </w:p>
+        <w:p>
+          <w:pPr>
+            <w:pStyle w:val="TOC1"/>
+            <w:tabs>
+              <w:tab w:val="right" w:leader="dot" w:pos="9350"/>
+            </w:tabs>
+            <w:rPr>
+              <w:b/>
+              <w:bCs/>
+              <w:noProof/>
+              <w:sz w:val="28"/>
+              <w:szCs w:val="28"/>
+            </w:rPr>
+          </w:pPr>
+          <w:hyperlink w:anchor="_Toc224819618" w:history="1">
+            <w:r>
+              <w:rPr>
+                <w:rStyle w:val="Hyperlink"/>
+                <w:b/>
+                <w:bCs/>
+                <w:noProof/>
+                <w:sz w:val="28"/>
+                <w:szCs w:val="28"/>
+              </w:rPr>
+              <w:t>7. Contact Page</w:t>
+            </w:r>
+            <w:r>
+              <w:rPr>
+                <w:b/>
+                <w:bCs/>
+                <w:noProof/>
+                <w:webHidden/>
+                <w:sz w:val="28"/>
+                <w:szCs w:val="28"/>
+              </w:rPr>
+              <w:tab/>
+            </w:r>
+            <w:r>
+              <w:rPr>
+                <w:b/>
+                <w:bCs/>
+                <w:noProof/>
+                <w:webHidden/>
+                <w:sz w:val="28"/>
+                <w:szCs w:val="28"/>
+              </w:rPr>
+              <w:fldChar w:fldCharType="begin"/>
+            </w:r>
+            <w:r>
+              <w:rPr>
+                <w:b/>
+                <w:bCs/>
+                <w:noProof/>
+                <w:webHidden/>
+                <w:sz w:val="28"/>
+                <w:szCs w:val="28"/>
+              </w:rPr>
+              <w:instrText xml:space="preserve"> PAGEREF _Toc224819618 \h </w:instrText>
+            </w:r>
+            <w:r>
+              <w:rPr>
+                <w:b/>
+                <w:bCs/>
+                <w:noProof/>
+                <w:webHidden/>
+                <w:sz w:val="28"/>
+                <w:szCs w:val="28"/>
+              </w:rPr>
+            </w:r>
+            <w:r>
+              <w:rPr>
+                <w:b/>
+                <w:bCs/>
+                <w:noProof/>
+                <w:webHidden/>
+                <w:sz w:val="28"/>
+                <w:szCs w:val="28"/>
+              </w:rPr>
+              <w:fldChar w:fldCharType="separate"/>
+            </w:r>
+            <w:r>
+              <w:rPr>
+                <w:b/>
+                <w:bCs/>
+                <w:noProof/>
+                <w:webHidden/>
+                <w:sz w:val="28"/>
+                <w:szCs w:val="28"/>
+              </w:rPr>
+              <w:t>9</w:t>
+            </w:r>
+            <w:r>
+              <w:rPr>
+                <w:b/>
+                <w:bCs/>
+                <w:noProof/>
+                <w:webHidden/>
+                <w:sz w:val="28"/>
+                <w:szCs w:val="28"/>
+              </w:rPr>
+              <w:fldChar w:fldCharType="end"/>
+            </w:r>
+          </w:hyperlink>
+        </w:p>
+        <w:p>
+          <w:pPr>
+            <w:pStyle w:val="TOC1"/>
+            <w:tabs>
+              <w:tab w:val="right" w:leader="dot" w:pos="9350"/>
+            </w:tabs>
+            <w:rPr>
+              <w:b/>
+              <w:bCs/>
+              <w:noProof/>
+              <w:sz w:val="28"/>
+              <w:szCs w:val="28"/>
+            </w:rPr>
+          </w:pPr>
+          <w:hyperlink w:anchor="_Toc224819619" w:history="1">
+            <w:r>
+              <w:rPr>
+                <w:rStyle w:val="Hyperlink"/>
+                <w:b/>
+                <w:bCs/>
+                <w:noProof/>
+                <w:sz w:val="28"/>
+                <w:szCs w:val="28"/>
+              </w:rPr>
+              <w:t>8. Skills and GitHub</w:t>
+            </w:r>
+            <w:r>
+              <w:rPr>
+                <w:b/>
+                <w:bCs/>
+                <w:noProof/>
+                <w:webHidden/>
+                <w:sz w:val="28"/>
+                <w:szCs w:val="28"/>
+              </w:rPr>
+              <w:tab/>
+            </w:r>
+            <w:r>
+              <w:rPr>
+                <w:b/>
+                <w:bCs/>
+                <w:noProof/>
+                <w:webHidden/>
+                <w:sz w:val="28"/>
+                <w:szCs w:val="28"/>
+              </w:rPr>
+              <w:fldChar w:fldCharType="begin"/>
+            </w:r>
+            <w:r>
+              <w:rPr>
+                <w:b/>
+                <w:bCs/>
+                <w:noProof/>
+                <w:webHidden/>
+                <w:sz w:val="28"/>
+                <w:szCs w:val="28"/>
+              </w:rPr>
+              <w:instrText xml:space="preserve"> PAGEREF _Toc224819619 \h </w:instrText>
+            </w:r>
+            <w:r>
+              <w:rPr>
+                <w:b/>
+                <w:bCs/>
+                <w:noProof/>
+                <w:webHidden/>
+                <w:sz w:val="28"/>
+                <w:szCs w:val="28"/>
+              </w:rPr>
+            </w:r>
+            <w:r>
+              <w:rPr>
+                <w:b/>
+                <w:bCs/>
+                <w:noProof/>
+                <w:webHidden/>
+                <w:sz w:val="28"/>
+                <w:szCs w:val="28"/>
+              </w:rPr>
+              <w:fldChar w:fldCharType="separate"/>
+            </w:r>
+            <w:r>
+              <w:rPr>
+                <w:b/>
+                <w:bCs/>
+                <w:noProof/>
+                <w:webHidden/>
+                <w:sz w:val="28"/>
+                <w:szCs w:val="28"/>
+              </w:rPr>
+              <w:t>10</w:t>
+            </w:r>
+            <w:r>
+              <w:rPr>
+                <w:b/>
+                <w:bCs/>
+                <w:noProof/>
+                <w:webHidden/>
+                <w:sz w:val="28"/>
+                <w:szCs w:val="28"/>
+              </w:rPr>
+              <w:fldChar w:fldCharType="end"/>
+            </w:r>
+          </w:hyperlink>
+        </w:p>
+        <w:p>
+          <w:pPr>
+            <w:pStyle w:val="TOC2"/>
+            <w:tabs>
+              <w:tab w:val="right" w:leader="dot" w:pos="9350"/>
+            </w:tabs>
+            <w:rPr>
+              <w:b/>
+              <w:bCs/>
+              <w:noProof/>
+              <w:sz w:val="28"/>
+              <w:szCs w:val="28"/>
+            </w:rPr>
+          </w:pPr>
+          <w:hyperlink w:anchor="_Toc224819620" w:history="1">
+            <w:r>
+              <w:rPr>
+                <w:rStyle w:val="Hyperlink"/>
+                <w:b/>
+                <w:bCs/>
+                <w:noProof/>
+                <w:sz w:val="28"/>
+                <w:szCs w:val="28"/>
+              </w:rPr>
+              <w:t>8.1 Frontend Skills</w:t>
+            </w:r>
+            <w:r>
+              <w:rPr>
+                <w:b/>
+                <w:bCs/>
+                <w:noProof/>
+                <w:webHidden/>
+                <w:sz w:val="28"/>
+                <w:szCs w:val="28"/>
+              </w:rPr>
+              <w:tab/>
+            </w:r>
+            <w:r>
+              <w:rPr>
+                <w:b/>
+                <w:bCs/>
+                <w:noProof/>
+                <w:webHidden/>
+                <w:sz w:val="28"/>
+                <w:szCs w:val="28"/>
+              </w:rPr>
+              <w:fldChar w:fldCharType="begin"/>
+            </w:r>
+            <w:r>
+              <w:rPr>
+                <w:b/>
+                <w:bCs/>
+                <w:noProof/>
+                <w:webHidden/>
+                <w:sz w:val="28"/>
+                <w:szCs w:val="28"/>
+              </w:rPr>
+              <w:instrText xml:space="preserve"> PAGEREF _Toc224819620 \h </w:instrText>
+            </w:r>
+            <w:r>
+              <w:rPr>
+                <w:b/>
+                <w:bCs/>
+                <w:noProof/>
+                <w:webHidden/>
+                <w:sz w:val="28"/>
+                <w:szCs w:val="28"/>
+              </w:rPr>
+            </w:r>
+            <w:r>
+              <w:rPr>
+                <w:b/>
+                <w:bCs/>
+                <w:noProof/>
+                <w:webHidden/>
+                <w:sz w:val="28"/>
+                <w:szCs w:val="28"/>
+              </w:rPr>
+              <w:fldChar w:fldCharType="separate"/>
+            </w:r>
+            <w:r>
+              <w:rPr>
+                <w:b/>
+                <w:bCs/>
+                <w:noProof/>
+                <w:webHidden/>
+                <w:sz w:val="28"/>
+                <w:szCs w:val="28"/>
+              </w:rPr>
+              <w:t>10</w:t>
+            </w:r>
+            <w:r>
+              <w:rPr>
+                <w:b/>
+                <w:bCs/>
+                <w:noProof/>
+                <w:webHidden/>
+                <w:sz w:val="28"/>
+                <w:szCs w:val="28"/>
+              </w:rPr>
+              <w:fldChar w:fldCharType="end"/>
+            </w:r>
+          </w:hyperlink>
+        </w:p>
+        <w:p>
+          <w:pPr>
+            <w:pStyle w:val="TOC2"/>
+            <w:tabs>
+              <w:tab w:val="right" w:leader="dot" w:pos="9350"/>
+            </w:tabs>
+            <w:rPr>
+              <w:b/>
+              <w:bCs/>
+              <w:noProof/>
+              <w:sz w:val="28"/>
+              <w:szCs w:val="28"/>
+            </w:rPr>
+          </w:pPr>
+          <w:hyperlink w:anchor="_Toc224819621" w:history="1">
+            <w:r>
+              <w:rPr>
+                <w:rStyle w:val="Hyperlink"/>
+                <w:b/>
+                <w:bCs/>
+                <w:noProof/>
+                <w:sz w:val="28"/>
+                <w:szCs w:val="28"/>
+              </w:rPr>
+              <w:t>8.2 Backend and Tools</w:t>
+            </w:r>
+            <w:r>
+              <w:rPr>
+                <w:b/>
+                <w:bCs/>
+                <w:noProof/>
+                <w:webHidden/>
+                <w:sz w:val="28"/>
+                <w:szCs w:val="28"/>
+              </w:rPr>
+              <w:tab/>
+            </w:r>
+            <w:r>
+              <w:rPr>
+                <w:b/>
+                <w:bCs/>
+                <w:noProof/>
+                <w:webHidden/>
+                <w:sz w:val="28"/>
+                <w:szCs w:val="28"/>
+              </w:rPr>
+              <w:fldChar w:fldCharType="begin"/>
+            </w:r>
+            <w:r>
+              <w:rPr>
+                <w:b/>
+                <w:bCs/>
+                <w:noProof/>
+                <w:webHidden/>
+                <w:sz w:val="28"/>
+                <w:szCs w:val="28"/>
+              </w:rPr>
+              <w:instrText xml:space="preserve"> PAGEREF _Toc224819621 \h </w:instrText>
+            </w:r>
+            <w:r>
+              <w:rPr>
+                <w:b/>
+                <w:bCs/>
+                <w:noProof/>
+                <w:webHidden/>
+                <w:sz w:val="28"/>
+                <w:szCs w:val="28"/>
+              </w:rPr>
+            </w:r>
+            <w:r>
+              <w:rPr>
+                <w:b/>
+                <w:bCs/>
+                <w:noProof/>
+                <w:webHidden/>
+                <w:sz w:val="28"/>
+                <w:szCs w:val="28"/>
+              </w:rPr>
+              <w:fldChar w:fldCharType="separate"/>
+            </w:r>
+            <w:r>
+              <w:rPr>
+                <w:b/>
+                <w:bCs/>
+                <w:noProof/>
+                <w:webHidden/>
+                <w:sz w:val="28"/>
+                <w:szCs w:val="28"/>
+              </w:rPr>
+              <w:t>10</w:t>
+            </w:r>
+            <w:r>
+              <w:rPr>
+                <w:b/>
+                <w:bCs/>
+                <w:noProof/>
+                <w:webHidden/>
+                <w:sz w:val="28"/>
+                <w:szCs w:val="28"/>
+              </w:rPr>
+              <w:fldChar w:fldCharType="end"/>
+            </w:r>
+          </w:hyperlink>
+        </w:p>
+        <w:p>
+          <w:pPr>
+            <w:pStyle w:val="TOC2"/>
+            <w:tabs>
+              <w:tab w:val="right" w:leader="dot" w:pos="9350"/>
+            </w:tabs>
+            <w:rPr>
+              <w:b/>
+              <w:bCs/>
+              <w:noProof/>
+              <w:sz w:val="28"/>
+              <w:szCs w:val="28"/>
+            </w:rPr>
+          </w:pPr>
+          <w:hyperlink w:anchor="_Toc224819622" w:history="1">
+            <w:r>
+              <w:rPr>
+                <w:rStyle w:val="Hyperlink"/>
+                <w:b/>
+                <w:bCs/>
+                <w:noProof/>
+                <w:sz w:val="28"/>
+                <w:szCs w:val="28"/>
+              </w:rPr>
+              <w:t>8.3 GitHub Repository</w:t>
+            </w:r>
+            <w:r>
+              <w:rPr>
+                <w:b/>
+                <w:bCs/>
+                <w:noProof/>
+                <w:webHidden/>
+                <w:sz w:val="28"/>
+                <w:szCs w:val="28"/>
+              </w:rPr>
+              <w:tab/>
+            </w:r>
+            <w:r>
+              <w:rPr>
+                <w:b/>
+                <w:bCs/>
+                <w:noProof/>
+                <w:webHidden/>
+                <w:sz w:val="28"/>
+                <w:szCs w:val="28"/>
+              </w:rPr>
+              <w:fldChar w:fldCharType="begin"/>
+            </w:r>
+            <w:r>
+              <w:rPr>
+                <w:b/>
+                <w:bCs/>
+                <w:noProof/>
+                <w:webHidden/>
+                <w:sz w:val="28"/>
+                <w:szCs w:val="28"/>
+              </w:rPr>
+              <w:instrText xml:space="preserve"> PAGEREF _Toc224819622 \h </w:instrText>
+            </w:r>
+            <w:r>
+              <w:rPr>
+                <w:b/>
+                <w:bCs/>
+                <w:noProof/>
+                <w:webHidden/>
+                <w:sz w:val="28"/>
+                <w:szCs w:val="28"/>
+              </w:rPr>
+            </w:r>
+            <w:r>
+              <w:rPr>
+                <w:b/>
+                <w:bCs/>
+                <w:noProof/>
+                <w:webHidden/>
+                <w:sz w:val="28"/>
+                <w:szCs w:val="28"/>
+              </w:rPr>
+              <w:fldChar w:fldCharType="separate"/>
+            </w:r>
+            <w:r>
+              <w:rPr>
+                <w:b/>
+                <w:bCs/>
+                <w:noProof/>
+                <w:webHidden/>
+                <w:sz w:val="28"/>
+                <w:szCs w:val="28"/>
+              </w:rPr>
+              <w:t>10</w:t>
+            </w:r>
+            <w:r>
+              <w:rPr>
+                <w:b/>
+                <w:bCs/>
+                <w:noProof/>
+                <w:webHidden/>
+                <w:sz w:val="28"/>
+                <w:szCs w:val="28"/>
+              </w:rPr>
+              <w:fldChar w:fldCharType="end"/>
+            </w:r>
+          </w:hyperlink>
+        </w:p>
+        <w:p>
+          <w:pPr>
+            <w:pStyle w:val="TOC1"/>
+            <w:tabs>
+              <w:tab w:val="right" w:leader="dot" w:pos="9350"/>
+            </w:tabs>
+            <w:rPr>
+              <w:b/>
+              <w:bCs/>
+              <w:noProof/>
+              <w:sz w:val="28"/>
+              <w:szCs w:val="28"/>
+            </w:rPr>
+          </w:pPr>
+          <w:hyperlink w:anchor="_Toc224819623" w:history="1">
+            <w:r>
+              <w:rPr>
+                <w:rStyle w:val="Hyperlink"/>
+                <w:b/>
+                <w:bCs/>
+                <w:noProof/>
+                <w:sz w:val="28"/>
+                <w:szCs w:val="28"/>
+              </w:rPr>
+              <w:t>9. Conclusion</w:t>
+            </w:r>
+            <w:r>
+              <w:rPr>
+                <w:b/>
+                <w:bCs/>
+                <w:noProof/>
+                <w:webHidden/>
+                <w:sz w:val="28"/>
+                <w:szCs w:val="28"/>
+              </w:rPr>
+              <w:tab/>
+            </w:r>
+            <w:r>
+              <w:rPr>
+                <w:b/>
+                <w:bCs/>
+                <w:noProof/>
+                <w:webHidden/>
+                <w:sz w:val="28"/>
+                <w:szCs w:val="28"/>
+              </w:rPr>
+              <w:fldChar w:fldCharType="begin"/>
+            </w:r>
+            <w:r>
+              <w:rPr>
+                <w:b/>
+                <w:bCs/>
+                <w:noProof/>
+                <w:webHidden/>
+                <w:sz w:val="28"/>
+                <w:szCs w:val="28"/>
+              </w:rPr>
+              <w:instrText xml:space="preserve"> PAGEREF _Toc224819623 \h </w:instrText>
+            </w:r>
+            <w:r>
+              <w:rPr>
+                <w:b/>
+                <w:bCs/>
+                <w:noProof/>
+                <w:webHidden/>
+                <w:sz w:val="28"/>
+                <w:szCs w:val="28"/>
+              </w:rPr>
+            </w:r>
+            <w:r>
+              <w:rPr>
+                <w:b/>
+                <w:bCs/>
+                <w:noProof/>
+                <w:webHidden/>
+                <w:sz w:val="28"/>
+                <w:szCs w:val="28"/>
+              </w:rPr>
+              <w:fldChar w:fldCharType="separate"/>
+            </w:r>
+            <w:r>
+              <w:rPr>
+                <w:b/>
+                <w:bCs/>
+                <w:noProof/>
+                <w:webHidden/>
+                <w:sz w:val="28"/>
+                <w:szCs w:val="28"/>
+              </w:rPr>
+              <w:t>11</w:t>
+            </w:r>
+            <w:r>
+              <w:rPr>
+                <w:b/>
+                <w:bCs/>
+                <w:noProof/>
+                <w:webHidden/>
+                <w:sz w:val="28"/>
+                <w:szCs w:val="28"/>
+              </w:rPr>
+              <w:fldChar w:fldCharType="end"/>
+            </w:r>
+          </w:hyperlink>
+        </w:p>
+        <w:p>
+          <w:r>
+            <w:rPr>
+              <w:b/>
+              <w:bCs/>
+              <w:noProof/>
+              <w:sz w:val="28"/>
+              <w:szCs w:val="28"/>
+            </w:rPr>
+            <w:fldChar w:fldCharType="end"/>
+          </w:r>
+        </w:p>
+      </w:sdtContent>
+    </w:sdt>
     <w:p/>
     <w:p>
       <w:pPr>
@@ -68,9 +3789,11 @@
       <w:pPr>
         <w:pStyle w:val="Heading1"/>
       </w:pPr>
+      <w:bookmarkStart w:id="0" w:name="_Toc224819589"/>
       <w:r>
         <w:t>1. Introduction</w:t>
       </w:r>
+      <w:bookmarkEnd w:id="0"/>
     </w:p>
     <w:p>
       <w:pPr>
@@ -101,9 +3824,11 @@
       <w:pPr>
         <w:pStyle w:val="Heading1"/>
       </w:pPr>
+      <w:bookmarkStart w:id="1" w:name="_Toc224819590"/>
       <w:r>
         <w:t>2. Full Stack Development</w:t>
       </w:r>
+      <w:bookmarkEnd w:id="1"/>
     </w:p>
     <w:p>
       <w:pPr>
@@ -118,9 +3843,11 @@
       <w:pPr>
         <w:pStyle w:val="Heading2"/>
       </w:pPr>
+      <w:bookmarkStart w:id="2" w:name="_Toc224819591"/>
       <w:r>
         <w:t>2.1 Frontend</w:t>
       </w:r>
+      <w:bookmarkEnd w:id="2"/>
     </w:p>
     <w:p>
       <w:pPr>
@@ -188,9 +3915,11 @@
       <w:pPr>
         <w:pStyle w:val="Heading2"/>
       </w:pPr>
+      <w:bookmarkStart w:id="3" w:name="_Toc224819592"/>
       <w:r>
         <w:t>2.2 Backend</w:t>
       </w:r>
+      <w:bookmarkEnd w:id="3"/>
     </w:p>
     <w:p>
       <w:pPr>
@@ -205,10 +3934,12 @@
       <w:pPr>
         <w:pStyle w:val="Heading2"/>
       </w:pPr>
+      <w:bookmarkStart w:id="4" w:name="_Toc224819593"/>
       <w:r>
         <w:lastRenderedPageBreak/>
         <w:t>2.3 Why Full Stack?</w:t>
       </w:r>
+      <w:bookmarkEnd w:id="4"/>
     </w:p>
     <w:p>
       <w:pPr>
@@ -250,10 +3981,12 @@
       <w:pPr>
         <w:pStyle w:val="Heading1"/>
       </w:pPr>
+      <w:bookmarkStart w:id="5" w:name="_Toc224819594"/>
       <w:r>
         <w:lastRenderedPageBreak/>
         <w:t>3. HTML</w:t>
       </w:r>
+      <w:bookmarkEnd w:id="5"/>
     </w:p>
     <w:p>
       <w:pPr>
@@ -268,9 +4001,11 @@
       <w:pPr>
         <w:pStyle w:val="Heading2"/>
       </w:pPr>
+      <w:bookmarkStart w:id="6" w:name="_Toc224819595"/>
       <w:r>
         <w:t>3.1 Semantic Elements</w:t>
       </w:r>
+      <w:bookmarkEnd w:id="6"/>
     </w:p>
     <w:p>
       <w:pPr>
@@ -285,9 +4020,11 @@
       <w:pPr>
         <w:pStyle w:val="Heading2"/>
       </w:pPr>
+      <w:bookmarkStart w:id="7" w:name="_Toc224819596"/>
       <w:r>
         <w:t>3.2 Forms and Inputs</w:t>
       </w:r>
+      <w:bookmarkEnd w:id="7"/>
     </w:p>
     <w:p>
       <w:pPr>
@@ -302,9 +4039,11 @@
       <w:pPr>
         <w:pStyle w:val="Heading2"/>
       </w:pPr>
+      <w:bookmarkStart w:id="8" w:name="_Toc224819597"/>
       <w:r>
         <w:t>3.3 Tables</w:t>
       </w:r>
+      <w:bookmarkEnd w:id="8"/>
     </w:p>
     <w:p>
       <w:pPr>
@@ -319,9 +4058,11 @@
       <w:pPr>
         <w:pStyle w:val="Heading2"/>
       </w:pPr>
+      <w:bookmarkStart w:id="9" w:name="_Toc224819598"/>
       <w:r>
         <w:t>3.4 Accessibility</w:t>
       </w:r>
+      <w:bookmarkEnd w:id="9"/>
     </w:p>
     <w:p>
       <w:pPr>
@@ -344,10 +4085,12 @@
       <w:pPr>
         <w:pStyle w:val="Heading1"/>
       </w:pPr>
+      <w:bookmarkStart w:id="10" w:name="_Toc224819599"/>
       <w:r>
         <w:lastRenderedPageBreak/>
         <w:t>4. CSS</w:t>
       </w:r>
+      <w:bookmarkEnd w:id="10"/>
     </w:p>
     <w:p>
       <w:pPr>
@@ -362,9 +4105,11 @@
       <w:pPr>
         <w:pStyle w:val="Heading2"/>
       </w:pPr>
+      <w:bookmarkStart w:id="11" w:name="_Toc224819600"/>
       <w:r>
         <w:t>4.1 The Box Model</w:t>
       </w:r>
+      <w:bookmarkEnd w:id="11"/>
     </w:p>
     <w:p>
       <w:pPr>
@@ -379,9 +4124,11 @@
       <w:pPr>
         <w:pStyle w:val="Heading2"/>
       </w:pPr>
+      <w:bookmarkStart w:id="12" w:name="_Toc224819601"/>
       <w:r>
         <w:t>4.2 Flexbox</w:t>
       </w:r>
+      <w:bookmarkEnd w:id="12"/>
     </w:p>
     <w:p>
       <w:pPr>
@@ -396,9 +4143,11 @@
       <w:pPr>
         <w:pStyle w:val="Heading2"/>
       </w:pPr>
+      <w:bookmarkStart w:id="13" w:name="_Toc224819602"/>
       <w:r>
         <w:t>4.3 CSS Grid</w:t>
       </w:r>
+      <w:bookmarkEnd w:id="13"/>
     </w:p>
     <w:p>
       <w:pPr>
@@ -413,9 +4162,11 @@
       <w:pPr>
         <w:pStyle w:val="Heading2"/>
       </w:pPr>
+      <w:bookmarkStart w:id="14" w:name="_Toc224819603"/>
       <w:r>
         <w:t>4.4 Animations and Transitions</w:t>
       </w:r>
+      <w:bookmarkEnd w:id="14"/>
     </w:p>
     <w:p>
       <w:pPr>
@@ -430,9 +4181,11 @@
       <w:pPr>
         <w:pStyle w:val="Heading2"/>
       </w:pPr>
+      <w:bookmarkStart w:id="15" w:name="_Toc224819604"/>
       <w:r>
         <w:t>4.5 Responsive Design</w:t>
       </w:r>
+      <w:bookmarkEnd w:id="15"/>
     </w:p>
     <w:p>
       <w:pPr>
@@ -447,9 +4200,11 @@
       <w:pPr>
         <w:pStyle w:val="Heading2"/>
       </w:pPr>
+      <w:bookmarkStart w:id="16" w:name="_Toc224819605"/>
       <w:r>
         <w:t>4.6 CSS Custom Properties</w:t>
       </w:r>
+      <w:bookmarkEnd w:id="16"/>
     </w:p>
     <w:p>
       <w:pPr>
@@ -478,10 +4233,12 @@
       <w:pPr>
         <w:pStyle w:val="Heading1"/>
       </w:pPr>
+      <w:bookmarkStart w:id="17" w:name="_Toc224819606"/>
       <w:r>
         <w:lastRenderedPageBreak/>
         <w:t>5. Bootstrap 5</w:t>
       </w:r>
+      <w:bookmarkEnd w:id="17"/>
     </w:p>
     <w:p>
       <w:pPr>
@@ -496,9 +4253,11 @@
       <w:pPr>
         <w:pStyle w:val="Heading2"/>
       </w:pPr>
+      <w:bookmarkStart w:id="18" w:name="_Toc224819607"/>
       <w:r>
         <w:t>5.1 The Grid System</w:t>
       </w:r>
+      <w:bookmarkEnd w:id="18"/>
     </w:p>
     <w:p>
       <w:pPr>
@@ -513,9 +4272,11 @@
       <w:pPr>
         <w:pStyle w:val="Heading2"/>
       </w:pPr>
+      <w:bookmarkStart w:id="19" w:name="_Toc224819608"/>
       <w:r>
         <w:t>5.2 Components</w:t>
       </w:r>
+      <w:bookmarkEnd w:id="19"/>
     </w:p>
     <w:p>
       <w:pPr>
@@ -530,9 +4291,11 @@
       <w:pPr>
         <w:pStyle w:val="Heading2"/>
       </w:pPr>
+      <w:bookmarkStart w:id="20" w:name="_Toc224819609"/>
       <w:r>
         <w:t>5.3 Utility Classes</w:t>
       </w:r>
+      <w:bookmarkEnd w:id="20"/>
     </w:p>
     <w:p>
       <w:pPr>
@@ -553,9 +4316,11 @@
       <w:pPr>
         <w:pStyle w:val="Heading2"/>
       </w:pPr>
+      <w:bookmarkStart w:id="21" w:name="_Toc224819610"/>
       <w:r>
         <w:t>5.4 JavaScript Plugins</w:t>
       </w:r>
+      <w:bookmarkEnd w:id="21"/>
     </w:p>
     <w:p>
       <w:pPr>
@@ -585,10 +4350,12 @@
       <w:pPr>
         <w:pStyle w:val="Heading1"/>
       </w:pPr>
+      <w:bookmarkStart w:id="22" w:name="_Toc224819611"/>
       <w:r>
         <w:lastRenderedPageBreak/>
         <w:t>6. JavaScript</w:t>
       </w:r>
+      <w:bookmarkEnd w:id="22"/>
     </w:p>
     <w:p>
       <w:pPr>
@@ -603,9 +4370,11 @@
       <w:pPr>
         <w:pStyle w:val="Heading2"/>
       </w:pPr>
+      <w:bookmarkStart w:id="23" w:name="_Toc224819612"/>
       <w:r>
         <w:t>6.1 DOM Manipulation</w:t>
       </w:r>
+      <w:bookmarkEnd w:id="23"/>
     </w:p>
     <w:p>
       <w:pPr>
@@ -620,9 +4389,11 @@
       <w:pPr>
         <w:pStyle w:val="Heading2"/>
       </w:pPr>
+      <w:bookmarkStart w:id="24" w:name="_Toc224819613"/>
       <w:r>
         <w:t>6.2 Event Listeners</w:t>
       </w:r>
+      <w:bookmarkEnd w:id="24"/>
     </w:p>
     <w:p>
       <w:pPr>
@@ -637,9 +4408,11 @@
       <w:pPr>
         <w:pStyle w:val="Heading2"/>
       </w:pPr>
+      <w:bookmarkStart w:id="25" w:name="_Toc224819614"/>
       <w:r>
         <w:t>6.3 ES6 Features</w:t>
       </w:r>
+      <w:bookmarkEnd w:id="25"/>
     </w:p>
     <w:p>
       <w:pPr>
@@ -654,9 +4427,11 @@
       <w:pPr>
         <w:pStyle w:val="Heading2"/>
       </w:pPr>
+      <w:bookmarkStart w:id="26" w:name="_Toc224819615"/>
       <w:r>
         <w:t>6.4 Form Validation</w:t>
       </w:r>
+      <w:bookmarkEnd w:id="26"/>
     </w:p>
     <w:p>
       <w:pPr>
@@ -671,9 +4446,11 @@
       <w:pPr>
         <w:pStyle w:val="Heading2"/>
       </w:pPr>
+      <w:bookmarkStart w:id="27" w:name="_Toc224819616"/>
       <w:r>
         <w:t>6.5 Array Methods</w:t>
       </w:r>
+      <w:bookmarkEnd w:id="27"/>
     </w:p>
     <w:p>
       <w:pPr>
@@ -694,9 +4471,11 @@
       <w:pPr>
         <w:pStyle w:val="Heading2"/>
       </w:pPr>
+      <w:bookmarkStart w:id="28" w:name="_Toc224819617"/>
       <w:r>
         <w:t>6.6 Fetch API</w:t>
       </w:r>
+      <w:bookmarkEnd w:id="28"/>
     </w:p>
     <w:p>
       <w:pPr>
@@ -711,10 +4490,12 @@
       <w:pPr>
         <w:pStyle w:val="Heading1"/>
       </w:pPr>
+      <w:bookmarkStart w:id="29" w:name="_Toc224819618"/>
       <w:r>
         <w:lastRenderedPageBreak/>
         <w:t>7. Contact Page</w:t>
       </w:r>
+      <w:bookmarkEnd w:id="29"/>
     </w:p>
     <w:p>
       <w:pPr>
@@ -752,18 +4533,22 @@
       <w:pPr>
         <w:pStyle w:val="Heading1"/>
       </w:pPr>
+      <w:bookmarkStart w:id="30" w:name="_Toc224819619"/>
       <w:r>
         <w:lastRenderedPageBreak/>
         <w:t>8. Skills and GitHub</w:t>
       </w:r>
+      <w:bookmarkEnd w:id="30"/>
     </w:p>
     <w:p>
       <w:pPr>
         <w:pStyle w:val="Heading2"/>
       </w:pPr>
+      <w:bookmarkStart w:id="31" w:name="_Toc224819620"/>
       <w:r>
         <w:t>8.1 Frontend Skills</w:t>
       </w:r>
+      <w:bookmarkEnd w:id="31"/>
     </w:p>
     <w:p>
       <w:pPr>
@@ -822,9 +4607,11 @@
       <w:pPr>
         <w:pStyle w:val="Heading2"/>
       </w:pPr>
+      <w:bookmarkStart w:id="32" w:name="_Toc224819621"/>
       <w:r>
         <w:t>8.2 Backend and Tools</w:t>
       </w:r>
+      <w:bookmarkEnd w:id="32"/>
     </w:p>
     <w:p>
       <w:pPr>
@@ -883,9 +4670,11 @@
       <w:pPr>
         <w:pStyle w:val="Heading2"/>
       </w:pPr>
+      <w:bookmarkStart w:id="33" w:name="_Toc224819622"/>
       <w:r>
         <w:t>8.3 GitHub Repository</w:t>
       </w:r>
+      <w:bookmarkEnd w:id="33"/>
     </w:p>
     <w:p>
       <w:pPr>
@@ -901,7 +4690,7 @@
         <w:spacing w:after="160" w:line="360" w:lineRule="auto"/>
         <w:jc w:val="both"/>
       </w:pPr>
-      <w:hyperlink r:id="rId6" w:history="1">
+      <w:hyperlink r:id="rId7" w:history="1">
         <w:r>
           <w:rPr>
             <w:rStyle w:val="Hyperlink"/>
@@ -918,7 +4707,7 @@
       <w:r>
         <w:t xml:space="preserve">LinkedIn Profile: </w:t>
       </w:r>
-      <w:hyperlink r:id="rId7" w:history="1">
+      <w:hyperlink r:id="rId8" w:history="1">
         <w:r>
           <w:rPr>
             <w:rStyle w:val="Hyperlink"/>
@@ -935,7 +4724,7 @@
       <w:r>
         <w:t xml:space="preserve">Personal Website: </w:t>
       </w:r>
-      <w:hyperlink r:id="rId8" w:history="1">
+      <w:hyperlink r:id="rId9" w:history="1">
         <w:r>
           <w:rPr>
             <w:rStyle w:val="Hyperlink"/>
@@ -953,10 +4742,12 @@
       <w:pPr>
         <w:pStyle w:val="Heading1"/>
       </w:pPr>
+      <w:bookmarkStart w:id="34" w:name="_Toc224819623"/>
       <w:r>
         <w:lastRenderedPageBreak/>
         <w:t>9. Conclusion</w:t>
       </w:r>
+      <w:bookmarkEnd w:id="34"/>
     </w:p>
     <w:p>
       <w:pPr>
@@ -1784,6 +5575,54 @@
       <w:u w:val="single"/>
     </w:rPr>
   </w:style>
+  <w:style w:type="paragraph" w:styleId="TOCHeading">
+    <w:name w:val="TOC Heading"/>
+    <w:basedOn w:val="Heading1"/>
+    <w:next w:val="Normal"/>
+    <w:uiPriority w:val="39"/>
+    <w:unhideWhenUsed/>
+    <w:qFormat/>
+    <w:rsid w:val="00264DF7"/>
+    <w:pPr>
+      <w:keepNext/>
+      <w:keepLines/>
+      <w:spacing w:after="0" w:line="259" w:lineRule="auto"/>
+      <w:outlineLvl w:val="9"/>
+    </w:pPr>
+    <w:rPr>
+      <w:rFonts w:asciiTheme="majorHAnsi" w:eastAsiaTheme="majorEastAsia" w:hAnsiTheme="majorHAnsi" w:cstheme="majorBidi"/>
+      <w:b w:val="0"/>
+      <w:bCs w:val="0"/>
+      <w:color w:val="0F4761" w:themeColor="accent1" w:themeShade="BF"/>
+      <w:sz w:val="32"/>
+      <w:szCs w:val="32"/>
+    </w:rPr>
+  </w:style>
+  <w:style w:type="paragraph" w:styleId="TOC1">
+    <w:name w:val="toc 1"/>
+    <w:basedOn w:val="Normal"/>
+    <w:next w:val="Normal"/>
+    <w:autoRedefine/>
+    <w:uiPriority w:val="39"/>
+    <w:unhideWhenUsed/>
+    <w:rsid w:val="00264DF7"/>
+    <w:pPr>
+      <w:spacing w:after="100"/>
+    </w:pPr>
+  </w:style>
+  <w:style w:type="paragraph" w:styleId="TOC2">
+    <w:name w:val="toc 2"/>
+    <w:basedOn w:val="Normal"/>
+    <w:next w:val="Normal"/>
+    <w:autoRedefine/>
+    <w:uiPriority w:val="39"/>
+    <w:unhideWhenUsed/>
+    <w:rsid w:val="00264DF7"/>
+    <w:pPr>
+      <w:spacing w:after="100"/>
+      <w:ind w:left="240"/>
+    </w:pPr>
+  </w:style>
 </w:styles>
 </file>
 
@@ -2100,4 +5939,16 @@
     </a:ext>
   </a:extLst>
 </a:theme>
+</file>
+
+<file path=customXml/item1.xml><?xml version="1.0" encoding="utf-8"?>
+<b:Sources xmlns:b="http://schemas.openxmlformats.org/officeDocument/2006/bibliography" xmlns="http://schemas.openxmlformats.org/officeDocument/2006/bibliography" SelectedStyle="\APASixthEditionOfficeOnline.xsl" StyleName="APA" Version="6"/>
+</file>
+
+<file path=customXml/itemProps1.xml><?xml version="1.0" encoding="utf-8"?>
+<ds:datastoreItem xmlns:ds="http://schemas.openxmlformats.org/officeDocument/2006/customXml" ds:itemID="{44F311B5-E5A3-4C9C-9192-CBF8983ACB94}">
+  <ds:schemaRefs>
+    <ds:schemaRef ds:uri="http://schemas.openxmlformats.org/officeDocument/2006/bibliography"/>
+  </ds:schemaRefs>
+</ds:datastoreItem>
 </file>
</xml_diff>